<commit_message>
docs: regenerate image sourcing request after day2 hook/story edit
This doc is generated from assets/generated/pwa/*.json and had gone
stale after the day2 content fix in the previous commit.

Co-Authored-By: Claude Sonnet 4.6 <noreply@anthropic.com>
</commit_message>
<xml_diff>
--- a/docs/thai_25day_image_sourcing_request.docx
+++ b/docs/thai_25day_image_sourcing_request.docx
@@ -21,7 +21,7 @@
         <w:rPr>
           <w:sz w:val="20"/>
         </w:rPr>
-        <w:t>작성일: 2026-06-25 | 용도: 평일 PWA/카카오 카드, 토요일 강의자료 이미지 수급</w:t>
+        <w:t>작성일: 2026-06-26 | 용도: 평일 PWA/카카오 카드, 토요일 강의자료 이미지 수급</w:t>
       </w:r>
     </w:p>
     <w:p>
@@ -278,7 +278,7 @@
                 <w:rFonts w:ascii="Arial" w:hAnsi="Arial" w:eastAsia="Malgun Gothic"/>
                 <w:b w:val="0"/>
               </w:rPr>
-              <w:t>W1D1, W1D2, W1D5, W1SAT</w:t>
+              <w:t>W1D1, W5D21, W1SAT</w:t>
             </w:r>
           </w:p>
         </w:tc>
@@ -379,7 +379,125 @@
                 <w:rFonts w:ascii="Arial" w:hAnsi="Arial" w:eastAsia="Malgun Gothic"/>
                 <w:b w:val="0"/>
               </w:rPr>
-              <w:t>W1D3</w:t>
+              <w:t>good_morning_good_evening</w:t>
+            </w:r>
+          </w:p>
+        </w:tc>
+        <w:tc>
+          <w:tcPr>
+            <w:tcW w:type="dxa" w:w="1728"/>
+            <w:vAlign w:val="center"/>
+          </w:tcPr>
+          <w:p>
+            <w:pPr>
+              <w:spacing w:after="0"/>
+            </w:pPr>
+            <w:r/>
+            <w:r>
+              <w:rPr>
+                <w:rFonts w:ascii="Arial" w:hAnsi="Arial" w:eastAsia="Malgun Gothic"/>
+                <w:b w:val="0"/>
+              </w:rPr>
+              <w:t>W1D2</w:t>
+            </w:r>
+          </w:p>
+        </w:tc>
+        <w:tc>
+          <w:tcPr>
+            <w:tcW w:type="dxa" w:w="1728"/>
+            <w:vAlign w:val="center"/>
+          </w:tcPr>
+          <w:p>
+            <w:pPr>
+              <w:spacing w:after="0"/>
+            </w:pPr>
+            <w:r/>
+            <w:r>
+              <w:rPr>
+                <w:rFonts w:ascii="Arial" w:hAnsi="Arial" w:eastAsia="Malgun Gothic"/>
+                <w:b w:val="0"/>
+              </w:rPr>
+              <w:t>아침에는 실내에서, 저녁에는 노을 진 마당에서 와이 인사를 나누는 두 장면</w:t>
+            </w:r>
+          </w:p>
+        </w:tc>
+        <w:tc>
+          <w:tcPr>
+            <w:tcW w:type="dxa" w:w="1728"/>
+            <w:vAlign w:val="center"/>
+          </w:tcPr>
+          <w:p>
+            <w:pPr>
+              <w:spacing w:after="0"/>
+            </w:pPr>
+            <w:r/>
+            <w:r>
+              <w:rPr>
+                <w:rFonts w:ascii="Arial" w:hAnsi="Arial" w:eastAsia="Malgun Gothic"/>
+                <w:b w:val="0"/>
+              </w:rPr>
+              <w:t>assets/images/scenes/good_morning_good_evening.jpg</w:t>
+            </w:r>
+          </w:p>
+        </w:tc>
+        <w:tc>
+          <w:tcPr>
+            <w:tcW w:type="dxa" w:w="1728"/>
+            <w:vAlign w:val="center"/>
+          </w:tcPr>
+          <w:p>
+            <w:pPr>
+              <w:spacing w:after="0"/>
+            </w:pPr>
+            <w:r/>
+            <w:r>
+              <w:rPr>
+                <w:rFonts w:ascii="Arial" w:hAnsi="Arial" w:eastAsia="Malgun Gothic"/>
+                <w:b w:val="0"/>
+              </w:rPr>
+              <w:t>준비됨</w:t>
+            </w:r>
+          </w:p>
+        </w:tc>
+        <w:tc>
+          <w:tcPr>
+            <w:tcW w:type="dxa" w:w="1728"/>
+            <w:vAlign w:val="center"/>
+          </w:tcPr>
+          <w:p>
+            <w:pPr>
+              <w:spacing w:after="0"/>
+            </w:pPr>
+            <w:r/>
+            <w:r>
+              <w:rPr>
+                <w:rFonts w:ascii="Arial" w:hAnsi="Arial" w:eastAsia="Malgun Gothic"/>
+                <w:b w:val="0"/>
+              </w:rPr>
+              <w:t>Thai wai greeting morning bedroom</w:t>
+              <w:br/>
+              <w:t>Thai wai greeting sunset guesthouse</w:t>
+            </w:r>
+          </w:p>
+        </w:tc>
+      </w:tr>
+      <w:tr>
+        <w:tc>
+          <w:tcPr>
+            <w:tcW w:type="dxa" w:w="1728"/>
+            <w:vAlign w:val="center"/>
+          </w:tcPr>
+          <w:p>
+            <w:pPr>
+              <w:spacing w:after="0"/>
+            </w:pPr>
+            <w:r/>
+            <w:r>
+              <w:rPr>
+                <w:rFonts w:ascii="Arial" w:hAnsi="Arial" w:eastAsia="Malgun Gothic"/>
+                <w:b w:val="0"/>
+              </w:rPr>
+              <w:t>thanks_a_lot_youre_welcome</w:t>
             </w:r>
           </w:p>
         </w:tc>
@@ -417,7 +535,7 @@
                 <w:rFonts w:ascii="Arial" w:hAnsi="Arial" w:eastAsia="Malgun Gothic"/>
                 <w:b w:val="0"/>
               </w:rPr>
-              <w:t>감사와 응답 학습 장면</w:t>
+              <w:t>감사를 전하고 따뜻하게 응답받는 장면</w:t>
             </w:r>
           </w:p>
         </w:tc>
@@ -436,6 +554,7 @@
                 <w:rFonts w:ascii="Arial" w:hAnsi="Arial" w:eastAsia="Malgun Gothic"/>
                 <w:b w:val="0"/>
               </w:rPr>
+              <w:t>assets/images/scenes/thanks_a_lot_youre_welcome.jpg</w:t>
             </w:r>
           </w:p>
         </w:tc>
@@ -454,7 +573,7 @@
                 <w:rFonts w:ascii="Arial" w:hAnsi="Arial" w:eastAsia="Malgun Gothic"/>
                 <w:b w:val="0"/>
               </w:rPr>
-              <w:t>사진 필요</w:t>
+              <w:t>준비됨</w:t>
             </w:r>
           </w:p>
         </w:tc>
@@ -473,9 +592,9 @@
                 <w:rFonts w:ascii="Arial" w:hAnsi="Arial" w:eastAsia="Malgun Gothic"/>
                 <w:b w:val="0"/>
               </w:rPr>
-              <w:t>감사와 응답</w:t>
+              <w:t>gratitude gift giving scene</w:t>
               <w:br/>
-              <w:t>도움을 받았을 때 감사하고 상대가 따뜻하게 응답한다.</w:t>
+              <w:t>thank you ceremony illustration</w:t>
             </w:r>
           </w:p>
         </w:tc>
@@ -496,7 +615,7 @@
                 <w:rFonts w:ascii="Arial" w:hAnsi="Arial" w:eastAsia="Malgun Gothic"/>
                 <w:b w:val="0"/>
               </w:rPr>
-              <w:t>W1D4</w:t>
+              <w:t>yes_no_checkpoint</w:t>
             </w:r>
           </w:p>
         </w:tc>
@@ -534,7 +653,7 @@
                 <w:rFonts w:ascii="Arial" w:hAnsi="Arial" w:eastAsia="Malgun Gothic"/>
                 <w:b w:val="0"/>
               </w:rPr>
-              <w:t>짧게 대답하기 학습 장면</w:t>
+              <w:t>짧은 질문에 예/아니오로 대답하는 장면</w:t>
             </w:r>
           </w:p>
         </w:tc>
@@ -553,6 +672,7 @@
                 <w:rFonts w:ascii="Arial" w:hAnsi="Arial" w:eastAsia="Malgun Gothic"/>
                 <w:b w:val="0"/>
               </w:rPr>
+              <w:t>assets/images/scenes/yes_no_checkpoint.jpg</w:t>
             </w:r>
           </w:p>
         </w:tc>
@@ -571,7 +691,7 @@
                 <w:rFonts w:ascii="Arial" w:hAnsi="Arial" w:eastAsia="Malgun Gothic"/>
                 <w:b w:val="0"/>
               </w:rPr>
-              <w:t>사진 필요</w:t>
+              <w:t>준비됨</w:t>
             </w:r>
           </w:p>
         </w:tc>
@@ -590,9 +710,127 @@
                 <w:rFonts w:ascii="Arial" w:hAnsi="Arial" w:eastAsia="Malgun Gothic"/>
                 <w:b w:val="0"/>
               </w:rPr>
-              <w:t>짧게 대답하기</w:t>
+              <w:t>Thai police checkpoint passport question</w:t>
               <w:br/>
-              <w:t>짧은 질문에 예/아니오로 반응한다.</w:t>
+              <w:t>short yes no question scene church gate</w:t>
+            </w:r>
+          </w:p>
+        </w:tc>
+      </w:tr>
+      <w:tr>
+        <w:tc>
+          <w:tcPr>
+            <w:tcW w:type="dxa" w:w="1728"/>
+            <w:vAlign w:val="center"/>
+          </w:tcPr>
+          <w:p>
+            <w:pPr>
+              <w:spacing w:after="0"/>
+            </w:pPr>
+            <w:r/>
+            <w:r>
+              <w:rPr>
+                <w:rFonts w:ascii="Arial" w:hAnsi="Arial" w:eastAsia="Malgun Gothic"/>
+                <w:b w:val="0"/>
+              </w:rPr>
+              <w:t>believe_in_jesus</w:t>
+            </w:r>
+          </w:p>
+        </w:tc>
+        <w:tc>
+          <w:tcPr>
+            <w:tcW w:type="dxa" w:w="1728"/>
+            <w:vAlign w:val="center"/>
+          </w:tcPr>
+          <w:p>
+            <w:pPr>
+              <w:spacing w:after="0"/>
+            </w:pPr>
+            <w:r/>
+            <w:r>
+              <w:rPr>
+                <w:rFonts w:ascii="Arial" w:hAnsi="Arial" w:eastAsia="Malgun Gothic"/>
+                <w:b w:val="0"/>
+              </w:rPr>
+              <w:t>W1D5</w:t>
+            </w:r>
+          </w:p>
+        </w:tc>
+        <w:tc>
+          <w:tcPr>
+            <w:tcW w:type="dxa" w:w="1728"/>
+            <w:vAlign w:val="center"/>
+          </w:tcPr>
+          <w:p>
+            <w:pPr>
+              <w:spacing w:after="0"/>
+            </w:pPr>
+            <w:r/>
+            <w:r>
+              <w:rPr>
+                <w:rFonts w:ascii="Arial" w:hAnsi="Arial" w:eastAsia="Malgun Gothic"/>
+                <w:b w:val="0"/>
+              </w:rPr>
+              <w:t>교회 앞에서 따뜻하게 전도지를 건네며 예수님을 믿으라고 권하는 장면</w:t>
+            </w:r>
+          </w:p>
+        </w:tc>
+        <w:tc>
+          <w:tcPr>
+            <w:tcW w:type="dxa" w:w="1728"/>
+            <w:vAlign w:val="center"/>
+          </w:tcPr>
+          <w:p>
+            <w:pPr>
+              <w:spacing w:after="0"/>
+            </w:pPr>
+            <w:r/>
+            <w:r>
+              <w:rPr>
+                <w:rFonts w:ascii="Arial" w:hAnsi="Arial" w:eastAsia="Malgun Gothic"/>
+                <w:b w:val="0"/>
+              </w:rPr>
+              <w:t>assets/images/scenes/believe_in_jesus.jpg</w:t>
+            </w:r>
+          </w:p>
+        </w:tc>
+        <w:tc>
+          <w:tcPr>
+            <w:tcW w:type="dxa" w:w="1728"/>
+            <w:vAlign w:val="center"/>
+          </w:tcPr>
+          <w:p>
+            <w:pPr>
+              <w:spacing w:after="0"/>
+            </w:pPr>
+            <w:r/>
+            <w:r>
+              <w:rPr>
+                <w:rFonts w:ascii="Arial" w:hAnsi="Arial" w:eastAsia="Malgun Gothic"/>
+                <w:b w:val="0"/>
+              </w:rPr>
+              <w:t>준비됨</w:t>
+            </w:r>
+          </w:p>
+        </w:tc>
+        <w:tc>
+          <w:tcPr>
+            <w:tcW w:type="dxa" w:w="1728"/>
+            <w:vAlign w:val="center"/>
+          </w:tcPr>
+          <w:p>
+            <w:pPr>
+              <w:spacing w:after="0"/>
+            </w:pPr>
+            <w:r/>
+            <w:r>
+              <w:rPr>
+                <w:rFonts w:ascii="Arial" w:hAnsi="Arial" w:eastAsia="Malgun Gothic"/>
+                <w:b w:val="0"/>
+              </w:rPr>
+              <w:t>handing gospel tract Thailand church</w:t>
+              <w:br/>
+              <w:t>Korean missionary greeting Thai novice monk</w:t>
             </w:r>
           </w:p>
         </w:tc>
@@ -749,7 +987,7 @@
                 <w:rFonts w:ascii="Arial" w:hAnsi="Arial" w:eastAsia="Malgun Gothic"/>
                 <w:b w:val="0"/>
               </w:rPr>
-              <w:t>W2D7, W2D8, W2SAT</w:t>
+              <w:t>W2D7, W2D8, W5D22, W2SAT</w:t>
             </w:r>
           </w:p>
         </w:tc>
@@ -967,7 +1205,7 @@
                 <w:rFonts w:ascii="Arial" w:hAnsi="Arial" w:eastAsia="Malgun Gothic"/>
                 <w:b w:val="0"/>
               </w:rPr>
-              <w:t>W2D10</w:t>
+              <w:t>encouragement_and_blessing</w:t>
             </w:r>
           </w:p>
         </w:tc>
@@ -986,7 +1224,7 @@
                 <w:rFonts w:ascii="Arial" w:hAnsi="Arial" w:eastAsia="Malgun Gothic"/>
                 <w:b w:val="0"/>
               </w:rPr>
-              <w:t>W2D10</w:t>
+              <w:t>W2D10, W4D16, W4D17, W4D18, W4D19, W4SAT</w:t>
             </w:r>
           </w:p>
         </w:tc>
@@ -1005,7 +1243,7 @@
                 <w:rFonts w:ascii="Arial" w:hAnsi="Arial" w:eastAsia="Malgun Gothic"/>
                 <w:b w:val="0"/>
               </w:rPr>
-              <w:t>새 친구 만나기 전체 연결 학습 장면</w:t>
+              <w:t>교회 안에서 사랑과 축복의 말을 따뜻하게 전하는 장면</w:t>
             </w:r>
           </w:p>
         </w:tc>
@@ -1024,6 +1262,7 @@
                 <w:rFonts w:ascii="Arial" w:hAnsi="Arial" w:eastAsia="Malgun Gothic"/>
                 <w:b w:val="0"/>
               </w:rPr>
+              <w:t>assets/images/scenes/encouragement_and_blessing.jpg</w:t>
             </w:r>
           </w:p>
         </w:tc>
@@ -1061,9 +1300,11 @@
                 <w:rFonts w:ascii="Arial" w:hAnsi="Arial" w:eastAsia="Malgun Gothic"/>
                 <w:b w:val="0"/>
               </w:rPr>
-              <w:t>새 친구 만나기 전체 연결</w:t>
+              <w:t>gentle church encouragement conversation</w:t>
               <w:br/>
-              <w:t>인사, 실례, 이름 묻기, 자기소개를 한 대화 안에서 이어 말한다.</w:t>
+              <w:t>supportive conversation church smiling</w:t>
+              <w:br/>
+              <w:t>blessing prayer church community</w:t>
             </w:r>
           </w:p>
         </w:tc>
@@ -1556,7 +1797,7 @@
                 <w:rFonts w:ascii="Arial" w:hAnsi="Arial" w:eastAsia="Malgun Gothic"/>
                 <w:b w:val="0"/>
               </w:rPr>
-              <w:t>encouragement_and_blessing</w:t>
+              <w:t>praise_invitation</w:t>
             </w:r>
           </w:p>
         </w:tc>
@@ -1575,7 +1816,7 @@
                 <w:rFonts w:ascii="Arial" w:hAnsi="Arial" w:eastAsia="Malgun Gothic"/>
                 <w:b w:val="0"/>
               </w:rPr>
-              <w:t>W4D16, W4D17, W4D18, W4D19, W4D20, W4SAT</w:t>
+              <w:t>W4D20, W5D24</w:t>
             </w:r>
           </w:p>
         </w:tc>
@@ -1594,7 +1835,7 @@
                 <w:rFonts w:ascii="Arial" w:hAnsi="Arial" w:eastAsia="Malgun Gothic"/>
                 <w:b w:val="0"/>
               </w:rPr>
-              <w:t>교회 안에서 사랑과 축복의 말을 따뜻하게 전하는 장면</w:t>
+              <w:t>작은 교회 모임에서 함께 찬양하도록 초대하는 장면</w:t>
             </w:r>
           </w:p>
         </w:tc>
@@ -1613,7 +1854,7 @@
                 <w:rFonts w:ascii="Arial" w:hAnsi="Arial" w:eastAsia="Malgun Gothic"/>
                 <w:b w:val="0"/>
               </w:rPr>
-              <w:t>assets/images/scenes/encouragement_and_blessing.jpg</w:t>
+              <w:t>assets/images/scenes/praise_invitation.jpg</w:t>
             </w:r>
           </w:p>
         </w:tc>
@@ -1651,245 +1892,11 @@
                 <w:rFonts w:ascii="Arial" w:hAnsi="Arial" w:eastAsia="Malgun Gothic"/>
                 <w:b w:val="0"/>
               </w:rPr>
-              <w:t>gentle church encouragement conversation</w:t>
+              <w:t>small church praise group singing together</w:t>
               <w:br/>
-              <w:t>supportive conversation church smiling</w:t>
+              <w:t>church worship small group joyful singing</w:t>
               <w:br/>
-              <w:t>blessing prayer church community</w:t>
-            </w:r>
-          </w:p>
-        </w:tc>
-      </w:tr>
-      <w:tr>
-        <w:tc>
-          <w:tcPr>
-            <w:tcW w:type="dxa" w:w="1728"/>
-            <w:vAlign w:val="center"/>
-          </w:tcPr>
-          <w:p>
-            <w:pPr>
-              <w:spacing w:after="0"/>
-            </w:pPr>
-            <w:r/>
-            <w:r>
-              <w:rPr>
-                <w:rFonts w:ascii="Arial" w:hAnsi="Arial" w:eastAsia="Malgun Gothic"/>
-                <w:b w:val="0"/>
-              </w:rPr>
-              <w:t>W5D21</w:t>
-            </w:r>
-          </w:p>
-        </w:tc>
-        <w:tc>
-          <w:tcPr>
-            <w:tcW w:type="dxa" w:w="1728"/>
-            <w:vAlign w:val="center"/>
-          </w:tcPr>
-          <w:p>
-            <w:pPr>
-              <w:spacing w:after="0"/>
-            </w:pPr>
-            <w:r/>
-            <w:r>
-              <w:rPr>
-                <w:rFonts w:ascii="Arial" w:hAnsi="Arial" w:eastAsia="Malgun Gothic"/>
-                <w:b w:val="0"/>
-              </w:rPr>
-              <w:t>W5D21</w:t>
-            </w:r>
-          </w:p>
-        </w:tc>
-        <w:tc>
-          <w:tcPr>
-            <w:tcW w:type="dxa" w:w="1728"/>
-            <w:vAlign w:val="center"/>
-          </w:tcPr>
-          <w:p>
-            <w:pPr>
-              <w:spacing w:after="0"/>
-            </w:pPr>
-            <w:r/>
-            <w:r>
-              <w:rPr>
-                <w:rFonts w:ascii="Arial" w:hAnsi="Arial" w:eastAsia="Malgun Gothic"/>
-                <w:b w:val="0"/>
-              </w:rPr>
-              <w:t>예수님 믿으세요 학습 장면</w:t>
-            </w:r>
-          </w:p>
-        </w:tc>
-        <w:tc>
-          <w:tcPr>
-            <w:tcW w:type="dxa" w:w="1728"/>
-            <w:vAlign w:val="center"/>
-          </w:tcPr>
-          <w:p>
-            <w:pPr>
-              <w:spacing w:after="0"/>
-            </w:pPr>
-            <w:r/>
-            <w:r>
-              <w:rPr>
-                <w:rFonts w:ascii="Arial" w:hAnsi="Arial" w:eastAsia="Malgun Gothic"/>
-                <w:b w:val="0"/>
-              </w:rPr>
-            </w:r>
-          </w:p>
-        </w:tc>
-        <w:tc>
-          <w:tcPr>
-            <w:tcW w:type="dxa" w:w="1728"/>
-            <w:vAlign w:val="center"/>
-          </w:tcPr>
-          <w:p>
-            <w:pPr>
-              <w:spacing w:after="0"/>
-            </w:pPr>
-            <w:r/>
-            <w:r>
-              <w:rPr>
-                <w:rFonts w:ascii="Arial" w:hAnsi="Arial" w:eastAsia="Malgun Gothic"/>
-                <w:b w:val="0"/>
-              </w:rPr>
-              <w:t>사진 필요</w:t>
-            </w:r>
-          </w:p>
-        </w:tc>
-        <w:tc>
-          <w:tcPr>
-            <w:tcW w:type="dxa" w:w="1728"/>
-            <w:vAlign w:val="center"/>
-          </w:tcPr>
-          <w:p>
-            <w:pPr>
-              <w:spacing w:after="0"/>
-            </w:pPr>
-            <w:r/>
-            <w:r>
-              <w:rPr>
-                <w:rFonts w:ascii="Arial" w:hAnsi="Arial" w:eastAsia="Malgun Gothic"/>
-                <w:b w:val="0"/>
-              </w:rPr>
-              <w:t>예수님 믿으세요</w:t>
-              <w:br/>
-              <w:t>상대의 마음을 존중하며 믿음의 권면을 전한다.</w:t>
-            </w:r>
-          </w:p>
-        </w:tc>
-      </w:tr>
-      <w:tr>
-        <w:tc>
-          <w:tcPr>
-            <w:tcW w:type="dxa" w:w="1728"/>
-            <w:vAlign w:val="center"/>
-          </w:tcPr>
-          <w:p>
-            <w:pPr>
-              <w:spacing w:after="0"/>
-            </w:pPr>
-            <w:r/>
-            <w:r>
-              <w:rPr>
-                <w:rFonts w:ascii="Arial" w:hAnsi="Arial" w:eastAsia="Malgun Gothic"/>
-                <w:b w:val="0"/>
-              </w:rPr>
-              <w:t>W5D22</w:t>
-            </w:r>
-          </w:p>
-        </w:tc>
-        <w:tc>
-          <w:tcPr>
-            <w:tcW w:type="dxa" w:w="1728"/>
-            <w:vAlign w:val="center"/>
-          </w:tcPr>
-          <w:p>
-            <w:pPr>
-              <w:spacing w:after="0"/>
-            </w:pPr>
-            <w:r/>
-            <w:r>
-              <w:rPr>
-                <w:rFonts w:ascii="Arial" w:hAnsi="Arial" w:eastAsia="Malgun Gothic"/>
-                <w:b w:val="0"/>
-              </w:rPr>
-              <w:t>W5D22</w:t>
-            </w:r>
-          </w:p>
-        </w:tc>
-        <w:tc>
-          <w:tcPr>
-            <w:tcW w:type="dxa" w:w="1728"/>
-            <w:vAlign w:val="center"/>
-          </w:tcPr>
-          <w:p>
-            <w:pPr>
-              <w:spacing w:after="0"/>
-            </w:pPr>
-            <w:r/>
-            <w:r>
-              <w:rPr>
-                <w:rFonts w:ascii="Arial" w:hAnsi="Arial" w:eastAsia="Malgun Gothic"/>
-                <w:b w:val="0"/>
-              </w:rPr>
-              <w:t>우리는 당신들을 사랑해요 학습 장면</w:t>
-            </w:r>
-          </w:p>
-        </w:tc>
-        <w:tc>
-          <w:tcPr>
-            <w:tcW w:type="dxa" w:w="1728"/>
-            <w:vAlign w:val="center"/>
-          </w:tcPr>
-          <w:p>
-            <w:pPr>
-              <w:spacing w:after="0"/>
-            </w:pPr>
-            <w:r/>
-            <w:r>
-              <w:rPr>
-                <w:rFonts w:ascii="Arial" w:hAnsi="Arial" w:eastAsia="Malgun Gothic"/>
-                <w:b w:val="0"/>
-              </w:rPr>
-            </w:r>
-          </w:p>
-        </w:tc>
-        <w:tc>
-          <w:tcPr>
-            <w:tcW w:type="dxa" w:w="1728"/>
-            <w:vAlign w:val="center"/>
-          </w:tcPr>
-          <w:p>
-            <w:pPr>
-              <w:spacing w:after="0"/>
-            </w:pPr>
-            <w:r/>
-            <w:r>
-              <w:rPr>
-                <w:rFonts w:ascii="Arial" w:hAnsi="Arial" w:eastAsia="Malgun Gothic"/>
-                <w:b w:val="0"/>
-              </w:rPr>
-              <w:t>사진 필요</w:t>
-            </w:r>
-          </w:p>
-        </w:tc>
-        <w:tc>
-          <w:tcPr>
-            <w:tcW w:type="dxa" w:w="1728"/>
-            <w:vAlign w:val="center"/>
-          </w:tcPr>
-          <w:p>
-            <w:pPr>
-              <w:spacing w:after="0"/>
-            </w:pPr>
-            <w:r/>
-            <w:r>
-              <w:rPr>
-                <w:rFonts w:ascii="Arial" w:hAnsi="Arial" w:eastAsia="Malgun Gothic"/>
-                <w:b w:val="0"/>
-              </w:rPr>
-              <w:t>우리는 당신들을 사랑해요</w:t>
-              <w:br/>
-              <w:t>개인이 아니라 공동체의 환대를 전하는 장면이다.</w:t>
+              <w:t>community praise gathering</w:t>
             </w:r>
           </w:p>
         </w:tc>
@@ -2028,7 +2035,7 @@
                 <w:rFonts w:ascii="Arial" w:hAnsi="Arial" w:eastAsia="Malgun Gothic"/>
                 <w:b w:val="0"/>
               </w:rPr>
-              <w:t>praise_invitation</w:t>
+              <w:t>full_mission_roleplay_review</w:t>
             </w:r>
           </w:p>
         </w:tc>
@@ -2047,7 +2054,7 @@
                 <w:rFonts w:ascii="Arial" w:hAnsi="Arial" w:eastAsia="Malgun Gothic"/>
                 <w:b w:val="0"/>
               </w:rPr>
-              <w:t>W5D24, W5D25, W5SAT</w:t>
+              <w:t>W5D25, W5SAT</w:t>
             </w:r>
           </w:p>
         </w:tc>
@@ -2066,7 +2073,7 @@
                 <w:rFonts w:ascii="Arial" w:hAnsi="Arial" w:eastAsia="Malgun Gothic"/>
                 <w:b w:val="0"/>
               </w:rPr>
-              <w:t>작은 교회 모임에서 함께 찬양하도록 초대하는 장면</w:t>
+              <w:t>처음 만남부터 기도와 찬양 초대까지 전체 흐름을 역할극으로 복습하는 장면</w:t>
             </w:r>
           </w:p>
         </w:tc>
@@ -2085,7 +2092,7 @@
                 <w:rFonts w:ascii="Arial" w:hAnsi="Arial" w:eastAsia="Malgun Gothic"/>
                 <w:b w:val="0"/>
               </w:rPr>
-              <w:t>assets/images/scenes/praise_invitation.jpg</w:t>
+              <w:t>assets/images/scenes/full_mission_roleplay_review.jpg</w:t>
             </w:r>
           </w:p>
         </w:tc>
@@ -2123,11 +2130,11 @@
                 <w:rFonts w:ascii="Arial" w:hAnsi="Arial" w:eastAsia="Malgun Gothic"/>
                 <w:b w:val="0"/>
               </w:rPr>
-              <w:t>small church praise group singing together</w:t>
+              <w:t>church mission team roleplay small group conversation</w:t>
               <w:br/>
-              <w:t>church worship small group joyful singing</w:t>
+              <w:t>small group church fellowship greeting prayer singing</w:t>
               <w:br/>
-              <w:t>community praise gathering</w:t>
+              <w:t>mission training roleplay church group</w:t>
             </w:r>
           </w:p>
         </w:tc>
@@ -2478,7 +2485,7 @@
                 <w:rFonts w:ascii="Arial" w:hAnsi="Arial" w:eastAsia="Malgun Gothic"/>
                 <w:b w:val="0"/>
               </w:rPr>
-              <w:t>교회 입구에서 태국 성도에게 와이 인사로 반갑게 인사하는 장면</w:t>
+              <w:t>아침에는 실내에서, 저녁에는 노을 진 마당에서 와이 인사를 나누는 두 장면</w:t>
             </w:r>
           </w:p>
         </w:tc>
@@ -2497,7 +2504,7 @@
                 <w:rFonts w:ascii="Arial" w:hAnsi="Arial" w:eastAsia="Malgun Gothic"/>
                 <w:b w:val="0"/>
               </w:rPr>
-              <w:t>assets/images/scenes/greeting_church_gate.jpg</w:t>
+              <w:t>assets/images/scenes/good_morning_good_evening.jpg</w:t>
             </w:r>
           </w:p>
         </w:tc>
@@ -2594,7 +2601,7 @@
                 <w:rFonts w:ascii="Arial" w:hAnsi="Arial" w:eastAsia="Malgun Gothic"/>
                 <w:b w:val="0"/>
               </w:rPr>
-              <w:t>감사와 응답 학습 장면</w:t>
+              <w:t>감사를 전하고 따뜻하게 응답받는 장면</w:t>
             </w:r>
           </w:p>
         </w:tc>
@@ -2613,6 +2620,7 @@
                 <w:rFonts w:ascii="Arial" w:hAnsi="Arial" w:eastAsia="Malgun Gothic"/>
                 <w:b w:val="0"/>
               </w:rPr>
+              <w:t>assets/images/scenes/thanks_a_lot_youre_welcome.jpg</w:t>
             </w:r>
           </w:p>
         </w:tc>
@@ -2631,7 +2639,7 @@
                 <w:rFonts w:ascii="Arial" w:hAnsi="Arial" w:eastAsia="Malgun Gothic"/>
                 <w:b w:val="0"/>
               </w:rPr>
-              <w:t>사진 필요</w:t>
+              <w:t>준비됨</w:t>
             </w:r>
           </w:p>
         </w:tc>
@@ -2709,7 +2717,7 @@
                 <w:rFonts w:ascii="Arial" w:hAnsi="Arial" w:eastAsia="Malgun Gothic"/>
                 <w:b w:val="0"/>
               </w:rPr>
-              <w:t>짧게 대답하기 학습 장면</w:t>
+              <w:t>짧은 질문에 예/아니오로 대답하는 장면</w:t>
             </w:r>
           </w:p>
         </w:tc>
@@ -2728,6 +2736,7 @@
                 <w:rFonts w:ascii="Arial" w:hAnsi="Arial" w:eastAsia="Malgun Gothic"/>
                 <w:b w:val="0"/>
               </w:rPr>
+              <w:t>assets/images/scenes/yes_no_checkpoint.jpg</w:t>
             </w:r>
           </w:p>
         </w:tc>
@@ -2746,7 +2755,7 @@
                 <w:rFonts w:ascii="Arial" w:hAnsi="Arial" w:eastAsia="Malgun Gothic"/>
                 <w:b w:val="0"/>
               </w:rPr>
-              <w:t>사진 필요</w:t>
+              <w:t>준비됨</w:t>
             </w:r>
           </w:p>
         </w:tc>
@@ -2805,7 +2814,7 @@
                 <w:rFonts w:ascii="Arial" w:hAnsi="Arial" w:eastAsia="Malgun Gothic"/>
                 <w:b w:val="0"/>
               </w:rPr>
-              <w:t>첫 만남 전체 연결</w:t>
+              <w:t>예수님 믿으세요</w:t>
             </w:r>
           </w:p>
         </w:tc>
@@ -2824,7 +2833,7 @@
                 <w:rFonts w:ascii="Arial" w:hAnsi="Arial" w:eastAsia="Malgun Gothic"/>
                 <w:b w:val="0"/>
               </w:rPr>
-              <w:t>교회 입구에서 태국 성도에게 와이 인사로 반갑게 인사하는 장면</w:t>
+              <w:t>교회 앞에서 따뜻하게 전도지를 건네며 예수님을 믿으라고 권하는 장면</w:t>
             </w:r>
           </w:p>
         </w:tc>
@@ -2843,7 +2852,7 @@
                 <w:rFonts w:ascii="Arial" w:hAnsi="Arial" w:eastAsia="Malgun Gothic"/>
                 <w:b w:val="0"/>
               </w:rPr>
-              <w:t>assets/images/scenes/greeting_church_gate.jpg</w:t>
+              <w:t>assets/images/scenes/believe_in_jesus.jpg</w:t>
             </w:r>
           </w:p>
         </w:tc>
@@ -3383,7 +3392,7 @@
                 <w:rFonts w:ascii="Arial" w:hAnsi="Arial" w:eastAsia="Malgun Gothic"/>
                 <w:b w:val="0"/>
               </w:rPr>
-              <w:t>새 친구 만나기 전체 연결</w:t>
+              <w:t>우리는 당신들을 사랑해요</w:t>
             </w:r>
           </w:p>
         </w:tc>
@@ -3402,7 +3411,7 @@
                 <w:rFonts w:ascii="Arial" w:hAnsi="Arial" w:eastAsia="Malgun Gothic"/>
                 <w:b w:val="0"/>
               </w:rPr>
-              <w:t>새 친구 만나기 전체 연결 학습 장면</w:t>
+              <w:t>교회 안에서 사랑과 축복의 말을 따뜻하게 전하는 장면</w:t>
             </w:r>
           </w:p>
         </w:tc>
@@ -3421,6 +3430,7 @@
                 <w:rFonts w:ascii="Arial" w:hAnsi="Arial" w:eastAsia="Malgun Gothic"/>
                 <w:b w:val="0"/>
               </w:rPr>
+              <w:t>assets/images/scenes/encouragement_and_blessing.jpg</w:t>
             </w:r>
           </w:p>
         </w:tc>
@@ -3960,7 +3970,7 @@
                 <w:rFonts w:ascii="Arial" w:hAnsi="Arial" w:eastAsia="Malgun Gothic"/>
                 <w:b w:val="0"/>
               </w:rPr>
-              <w:t>생활언어 전체 연결</w:t>
+              <w:t>기도해 드릴게요</w:t>
             </w:r>
           </w:p>
         </w:tc>
@@ -4540,7 +4550,7 @@
                 <w:rFonts w:ascii="Arial" w:hAnsi="Arial" w:eastAsia="Malgun Gothic"/>
                 <w:b w:val="0"/>
               </w:rPr>
-              <w:t>사랑과 축복 연결</w:t>
+              <w:t>함께 찬양해요</w:t>
             </w:r>
           </w:p>
         </w:tc>
@@ -4559,7 +4569,7 @@
                 <w:rFonts w:ascii="Arial" w:hAnsi="Arial" w:eastAsia="Malgun Gothic"/>
                 <w:b w:val="0"/>
               </w:rPr>
-              <w:t>교회 안에서 사랑과 축복의 말을 따뜻하게 전하는 장면</w:t>
+              <w:t>작은 교회 모임에서 함께 찬양하도록 초대하는 장면</w:t>
             </w:r>
           </w:p>
         </w:tc>
@@ -4578,7 +4588,7 @@
                 <w:rFonts w:ascii="Arial" w:hAnsi="Arial" w:eastAsia="Malgun Gothic"/>
                 <w:b w:val="0"/>
               </w:rPr>
-              <w:t>assets/images/scenes/encouragement_and_blessing.jpg</w:t>
+              <w:t>assets/images/scenes/praise_invitation.jpg</w:t>
             </w:r>
           </w:p>
         </w:tc>
@@ -4656,7 +4666,7 @@
                 <w:rFonts w:ascii="Arial" w:hAnsi="Arial" w:eastAsia="Malgun Gothic"/>
                 <w:b w:val="0"/>
               </w:rPr>
-              <w:t>예수님 믿으세요</w:t>
+              <w:t>인사와 감사 전체 복습</w:t>
             </w:r>
           </w:p>
         </w:tc>
@@ -4675,7 +4685,7 @@
                 <w:rFonts w:ascii="Arial" w:hAnsi="Arial" w:eastAsia="Malgun Gothic"/>
                 <w:b w:val="0"/>
               </w:rPr>
-              <w:t>예수님 믿으세요 학습 장면</w:t>
+              <w:t>교회 입구에서 태국 성도에게 와이 인사로 반갑게 인사하는 장면</w:t>
             </w:r>
           </w:p>
         </w:tc>
@@ -4694,6 +4704,7 @@
                 <w:rFonts w:ascii="Arial" w:hAnsi="Arial" w:eastAsia="Malgun Gothic"/>
                 <w:b w:val="0"/>
               </w:rPr>
+              <w:t>assets/images/scenes/greeting_church_gate.jpg</w:t>
             </w:r>
           </w:p>
         </w:tc>
@@ -4712,7 +4723,7 @@
                 <w:rFonts w:ascii="Arial" w:hAnsi="Arial" w:eastAsia="Malgun Gothic"/>
                 <w:b w:val="0"/>
               </w:rPr>
-              <w:t>사진 필요</w:t>
+              <w:t>준비됨</w:t>
             </w:r>
           </w:p>
         </w:tc>
@@ -4771,7 +4782,7 @@
                 <w:rFonts w:ascii="Arial" w:hAnsi="Arial" w:eastAsia="Malgun Gothic"/>
                 <w:b w:val="0"/>
               </w:rPr>
-              <w:t>우리는 당신들을 사랑해요</w:t>
+              <w:t>새 친구와 자기소개 복습</w:t>
             </w:r>
           </w:p>
         </w:tc>
@@ -4790,7 +4801,7 @@
                 <w:rFonts w:ascii="Arial" w:hAnsi="Arial" w:eastAsia="Malgun Gothic"/>
                 <w:b w:val="0"/>
               </w:rPr>
-              <w:t>우리는 당신들을 사랑해요 학습 장면</w:t>
+              <w:t>예배 후 처음 만나 이름을 묻고 자기소개하는 장면</w:t>
             </w:r>
           </w:p>
         </w:tc>
@@ -4809,6 +4820,7 @@
                 <w:rFonts w:ascii="Arial" w:hAnsi="Arial" w:eastAsia="Malgun Gothic"/>
                 <w:b w:val="0"/>
               </w:rPr>
+              <w:t>assets/images/scenes/name_intro_conversation.jpg</w:t>
             </w:r>
           </w:p>
         </w:tc>
@@ -4886,7 +4898,7 @@
                 <w:rFonts w:ascii="Arial" w:hAnsi="Arial" w:eastAsia="Malgun Gothic"/>
                 <w:b w:val="0"/>
               </w:rPr>
-              <w:t>기도해 드릴게요</w:t>
+              <w:t>생활 대화와 돌봄 복습</w:t>
             </w:r>
           </w:p>
         </w:tc>
@@ -5002,7 +5014,7 @@
                 <w:rFonts w:ascii="Arial" w:hAnsi="Arial" w:eastAsia="Malgun Gothic"/>
                 <w:b w:val="0"/>
               </w:rPr>
-              <w:t>함께 찬양해요</w:t>
+              <w:t>사랑·축복·믿음·찬양 복습</w:t>
             </w:r>
           </w:p>
         </w:tc>
@@ -5118,7 +5130,7 @@
                 <w:rFonts w:ascii="Arial" w:hAnsi="Arial" w:eastAsia="Malgun Gothic"/>
                 <w:b w:val="0"/>
               </w:rPr>
-              <w:t>전체 종합 리허설</w:t>
+              <w:t>전체 24문장 종합 리허설</w:t>
             </w:r>
           </w:p>
         </w:tc>
@@ -5137,7 +5149,7 @@
                 <w:rFonts w:ascii="Arial" w:hAnsi="Arial" w:eastAsia="Malgun Gothic"/>
                 <w:b w:val="0"/>
               </w:rPr>
-              <w:t>작은 교회 모임에서 함께 찬양하도록 초대하는 장면</w:t>
+              <w:t>처음 만남부터 기도와 찬양 초대까지 전체 흐름을 역할극으로 복습하는 장면</w:t>
             </w:r>
           </w:p>
         </w:tc>
@@ -5156,7 +5168,7 @@
                 <w:rFonts w:ascii="Arial" w:hAnsi="Arial" w:eastAsia="Malgun Gothic"/>
                 <w:b w:val="0"/>
               </w:rPr>
-              <w:t>assets/images/scenes/praise_invitation.jpg</w:t>
+              <w:t>assets/images/scenes/full_mission_roleplay_review.jpg</w:t>
             </w:r>
           </w:p>
         </w:tc>
@@ -5698,7 +5710,7 @@
                 <w:rFonts w:ascii="Arial" w:hAnsi="Arial" w:eastAsia="Malgun Gothic"/>
                 <w:b w:val="0"/>
               </w:rPr>
-              <w:t>처음 만남에서 찬양 초대까지</w:t>
+              <w:t>전체 24문장 종합 역할극</w:t>
             </w:r>
           </w:p>
         </w:tc>
@@ -5717,7 +5729,7 @@
                 <w:rFonts w:ascii="Arial" w:hAnsi="Arial" w:eastAsia="Malgun Gothic"/>
                 <w:b w:val="0"/>
               </w:rPr>
-              <w:t>작은 교회 모임에서 함께 찬양하도록 초대하는 장면</w:t>
+              <w:t>처음 만남부터 기도와 찬양 초대까지 전체 흐름을 역할극으로 복습하는 장면</w:t>
             </w:r>
           </w:p>
         </w:tc>
@@ -5736,7 +5748,7 @@
                 <w:rFonts w:ascii="Arial" w:hAnsi="Arial" w:eastAsia="Malgun Gothic"/>
                 <w:b w:val="0"/>
               </w:rPr>
-              <w:t>assets/images/scenes/praise_invitation.jpg</w:t>
+              <w:t>assets/images/scenes/full_mission_roleplay_review.jpg</w:t>
             </w:r>
           </w:p>
         </w:tc>

</xml_diff>

<commit_message>
Document app handoff for Claude
</commit_message>
<xml_diff>
--- a/docs/thai_25day_image_sourcing_request.docx
+++ b/docs/thai_25day_image_sourcing_request.docx
@@ -851,7 +851,7 @@
                 <w:rFonts w:ascii="Arial" w:hAnsi="Arial" w:eastAsia="Malgun Gothic"/>
                 <w:b w:val="0"/>
               </w:rPr>
-              <w:t>W2D6</w:t>
+              <w:t>polite_excuse_reassurance</w:t>
             </w:r>
           </w:p>
         </w:tc>
@@ -889,7 +889,7 @@
                 <w:rFonts w:ascii="Arial" w:hAnsi="Arial" w:eastAsia="Malgun Gothic"/>
                 <w:b w:val="0"/>
               </w:rPr>
-              <w:t>정중하게 말 걸기 학습 장면</w:t>
+              <w:t>교회 복도에서 정중하게 실례를 구하고 따뜻하게 응답받는 장면</w:t>
             </w:r>
           </w:p>
         </w:tc>
@@ -908,6 +908,7 @@
                 <w:rFonts w:ascii="Arial" w:hAnsi="Arial" w:eastAsia="Malgun Gothic"/>
                 <w:b w:val="0"/>
               </w:rPr>
+              <w:t>assets/images/scenes/polite_excuse_reassurance.jpg</w:t>
             </w:r>
           </w:p>
         </w:tc>
@@ -926,7 +927,7 @@
                 <w:rFonts w:ascii="Arial" w:hAnsi="Arial" w:eastAsia="Malgun Gothic"/>
                 <w:b w:val="0"/>
               </w:rPr>
-              <w:t>사진 필요</w:t>
+              <w:t>준비됨</w:t>
             </w:r>
           </w:p>
         </w:tc>
@@ -945,9 +946,11 @@
                 <w:rFonts w:ascii="Arial" w:hAnsi="Arial" w:eastAsia="Malgun Gothic"/>
                 <w:b w:val="0"/>
               </w:rPr>
-              <w:t>정중하게 말 걸기</w:t>
+              <w:t>polite wai greeting church hallway Thailand</w:t>
               <w:br/>
-              <w:t>사람 사이를 지나가거나 작은 실수를 했을 때 정중하게 말한다.</w:t>
+              <w:t>church hallway polite greeting Asian adults</w:t>
+              <w:br/>
+              <w:t>Thai church respectful excuse me conversation</w:t>
             </w:r>
           </w:p>
         </w:tc>
@@ -1006,7 +1009,7 @@
                 <w:rFonts w:ascii="Arial" w:hAnsi="Arial" w:eastAsia="Malgun Gothic"/>
                 <w:b w:val="0"/>
               </w:rPr>
-              <w:t>예배 후 처음 만나 이름을 묻고 자기소개하는 장면</w:t>
+              <w:t>교회 친교 자리에서 이름을 묻고 자기 이름을 소개하는 장면</w:t>
             </w:r>
           </w:p>
         </w:tc>
@@ -1044,7 +1047,7 @@
                 <w:rFonts w:ascii="Arial" w:hAnsi="Arial" w:eastAsia="Malgun Gothic"/>
                 <w:b w:val="0"/>
               </w:rPr>
-              <w:t>사진 필요</w:t>
+              <w:t>준비됨</w:t>
             </w:r>
           </w:p>
         </w:tc>
@@ -1088,7 +1091,7 @@
                 <w:rFonts w:ascii="Arial" w:hAnsi="Arial" w:eastAsia="Malgun Gothic"/>
                 <w:b w:val="0"/>
               </w:rPr>
-              <w:t>W2D9</w:t>
+              <w:t>age_question_child</w:t>
             </w:r>
           </w:p>
         </w:tc>
@@ -1126,7 +1129,7 @@
                 <w:rFonts w:ascii="Arial" w:hAnsi="Arial" w:eastAsia="Malgun Gothic"/>
                 <w:b w:val="0"/>
               </w:rPr>
-              <w:t>나이 묻기 학습 장면</w:t>
+              <w:t>교회 마당에서 어린이에게 나이를 조심스럽고 친근하게 묻는 장면</w:t>
             </w:r>
           </w:p>
         </w:tc>
@@ -1145,6 +1148,7 @@
                 <w:rFonts w:ascii="Arial" w:hAnsi="Arial" w:eastAsia="Malgun Gothic"/>
                 <w:b w:val="0"/>
               </w:rPr>
+              <w:t>assets/images/scenes/age_question_child.jpg</w:t>
             </w:r>
           </w:p>
         </w:tc>
@@ -1163,7 +1167,7 @@
                 <w:rFonts w:ascii="Arial" w:hAnsi="Arial" w:eastAsia="Malgun Gothic"/>
                 <w:b w:val="0"/>
               </w:rPr>
-              <w:t>사진 필요</w:t>
+              <w:t>준비됨</w:t>
             </w:r>
           </w:p>
         </w:tc>
@@ -1182,9 +1186,11 @@
                 <w:rFonts w:ascii="Arial" w:hAnsi="Arial" w:eastAsia="Malgun Gothic"/>
                 <w:b w:val="0"/>
               </w:rPr>
-              <w:t>나이 묻기</w:t>
+              <w:t>friendly adult asking child age church yard</w:t>
               <w:br/>
-              <w:t>친한 사이 또는 어린이에게 나이를 묻는 장면을 연습한다.</w:t>
+              <w:t>Asian woman talking with child garden</w:t>
+              <w:br/>
+              <w:t>warm church courtyard child conversation</w:t>
             </w:r>
           </w:p>
         </w:tc>
@@ -1205,7 +1211,7 @@
                 <w:rFonts w:ascii="Arial" w:hAnsi="Arial" w:eastAsia="Malgun Gothic"/>
                 <w:b w:val="0"/>
               </w:rPr>
-              <w:t>encouragement_and_blessing</w:t>
+              <w:t>we_love_you_group</w:t>
             </w:r>
           </w:p>
         </w:tc>
@@ -1224,7 +1230,7 @@
                 <w:rFonts w:ascii="Arial" w:hAnsi="Arial" w:eastAsia="Malgun Gothic"/>
                 <w:b w:val="0"/>
               </w:rPr>
-              <w:t>W2D10, W4D16, W4D17, W4D18, W4D19, W4SAT</w:t>
+              <w:t>W2D10</w:t>
             </w:r>
           </w:p>
         </w:tc>
@@ -1243,7 +1249,7 @@
                 <w:rFonts w:ascii="Arial" w:hAnsi="Arial" w:eastAsia="Malgun Gothic"/>
                 <w:b w:val="0"/>
               </w:rPr>
-              <w:t>교회 안에서 사랑과 축복의 말을 따뜻하게 전하는 장면</w:t>
+              <w:t>태국 교회 마당에서 공동체가 우리는 당신들을 사랑해요라고 따뜻하게 전하는 장면</w:t>
             </w:r>
           </w:p>
         </w:tc>
@@ -1262,7 +1268,7 @@
                 <w:rFonts w:ascii="Arial" w:hAnsi="Arial" w:eastAsia="Malgun Gothic"/>
                 <w:b w:val="0"/>
               </w:rPr>
-              <w:t>assets/images/scenes/encouragement_and_blessing.jpg</w:t>
+              <w:t>assets/images/scenes/we_love_you_group.jpg</w:t>
             </w:r>
           </w:p>
         </w:tc>
@@ -1281,7 +1287,7 @@
                 <w:rFonts w:ascii="Arial" w:hAnsi="Arial" w:eastAsia="Malgun Gothic"/>
                 <w:b w:val="0"/>
               </w:rPr>
-              <w:t>사진 필요</w:t>
+              <w:t>준비됨</w:t>
             </w:r>
           </w:p>
         </w:tc>
@@ -1300,11 +1306,11 @@
                 <w:rFonts w:ascii="Arial" w:hAnsi="Arial" w:eastAsia="Malgun Gothic"/>
                 <w:b w:val="0"/>
               </w:rPr>
-              <w:t>gentle church encouragement conversation</w:t>
+              <w:t>mission team and local church group we love you Thailand</w:t>
               <w:br/>
-              <w:t>supportive conversation church smiling</w:t>
+              <w:t>church community welcoming mission team village Thailand</w:t>
               <w:br/>
-              <w:t>blessing prayer church community</w:t>
+              <w:t>warm group greeting church village Thailand</w:t>
             </w:r>
           </w:p>
         </w:tc>
@@ -1777,6 +1783,126 @@
               <w:t>작별 인사</w:t>
               <w:br/>
               <w:t>식사와 행사가 끝난 뒤 자연스럽게 헤어진다.</w:t>
+            </w:r>
+          </w:p>
+        </w:tc>
+      </w:tr>
+      <w:tr>
+        <w:tc>
+          <w:tcPr>
+            <w:tcW w:type="dxa" w:w="1728"/>
+            <w:vAlign w:val="center"/>
+          </w:tcPr>
+          <w:p>
+            <w:pPr>
+              <w:spacing w:after="0"/>
+            </w:pPr>
+            <w:r/>
+            <w:r>
+              <w:rPr>
+                <w:rFonts w:ascii="Arial" w:hAnsi="Arial" w:eastAsia="Malgun Gothic"/>
+                <w:b w:val="0"/>
+              </w:rPr>
+              <w:t>encouragement_and_blessing</w:t>
+            </w:r>
+          </w:p>
+        </w:tc>
+        <w:tc>
+          <w:tcPr>
+            <w:tcW w:type="dxa" w:w="1728"/>
+            <w:vAlign w:val="center"/>
+          </w:tcPr>
+          <w:p>
+            <w:pPr>
+              <w:spacing w:after="0"/>
+            </w:pPr>
+            <w:r/>
+            <w:r>
+              <w:rPr>
+                <w:rFonts w:ascii="Arial" w:hAnsi="Arial" w:eastAsia="Malgun Gothic"/>
+                <w:b w:val="0"/>
+              </w:rPr>
+              <w:t>W4D16, W4D17, W4D18, W4D19, W4SAT</w:t>
+            </w:r>
+          </w:p>
+        </w:tc>
+        <w:tc>
+          <w:tcPr>
+            <w:tcW w:type="dxa" w:w="1728"/>
+            <w:vAlign w:val="center"/>
+          </w:tcPr>
+          <w:p>
+            <w:pPr>
+              <w:spacing w:after="0"/>
+            </w:pPr>
+            <w:r/>
+            <w:r>
+              <w:rPr>
+                <w:rFonts w:ascii="Arial" w:hAnsi="Arial" w:eastAsia="Malgun Gothic"/>
+                <w:b w:val="0"/>
+              </w:rPr>
+              <w:t>교회 안에서 사랑과 축복의 말을 따뜻하게 전하는 장면</w:t>
+            </w:r>
+          </w:p>
+        </w:tc>
+        <w:tc>
+          <w:tcPr>
+            <w:tcW w:type="dxa" w:w="1728"/>
+            <w:vAlign w:val="center"/>
+          </w:tcPr>
+          <w:p>
+            <w:pPr>
+              <w:spacing w:after="0"/>
+            </w:pPr>
+            <w:r/>
+            <w:r>
+              <w:rPr>
+                <w:rFonts w:ascii="Arial" w:hAnsi="Arial" w:eastAsia="Malgun Gothic"/>
+                <w:b w:val="0"/>
+              </w:rPr>
+              <w:t>assets/images/scenes/encouragement_and_blessing.jpg</w:t>
+            </w:r>
+          </w:p>
+        </w:tc>
+        <w:tc>
+          <w:tcPr>
+            <w:tcW w:type="dxa" w:w="1728"/>
+            <w:vAlign w:val="center"/>
+          </w:tcPr>
+          <w:p>
+            <w:pPr>
+              <w:spacing w:after="0"/>
+            </w:pPr>
+            <w:r/>
+            <w:r>
+              <w:rPr>
+                <w:rFonts w:ascii="Arial" w:hAnsi="Arial" w:eastAsia="Malgun Gothic"/>
+                <w:b w:val="0"/>
+              </w:rPr>
+              <w:t>사진 필요</w:t>
+            </w:r>
+          </w:p>
+        </w:tc>
+        <w:tc>
+          <w:tcPr>
+            <w:tcW w:type="dxa" w:w="1728"/>
+            <w:vAlign w:val="center"/>
+          </w:tcPr>
+          <w:p>
+            <w:pPr>
+              <w:spacing w:after="0"/>
+            </w:pPr>
+            <w:r/>
+            <w:r>
+              <w:rPr>
+                <w:rFonts w:ascii="Arial" w:hAnsi="Arial" w:eastAsia="Malgun Gothic"/>
+                <w:b w:val="0"/>
+              </w:rPr>
+              <w:t>gentle church encouragement conversation</w:t>
+              <w:br/>
+              <w:t>supportive conversation church smiling</w:t>
+              <w:br/>
+              <w:t>blessing prayer church community</w:t>
             </w:r>
           </w:p>
         </w:tc>
@@ -2949,7 +3075,7 @@
                 <w:rFonts w:ascii="Arial" w:hAnsi="Arial" w:eastAsia="Malgun Gothic"/>
                 <w:b w:val="0"/>
               </w:rPr>
-              <w:t>정중하게 말 걸기 학습 장면</w:t>
+              <w:t>교회 복도에서 정중하게 실례를 구하고 따뜻하게 응답받는 장면</w:t>
             </w:r>
           </w:p>
         </w:tc>
@@ -2968,6 +3094,7 @@
                 <w:rFonts w:ascii="Arial" w:hAnsi="Arial" w:eastAsia="Malgun Gothic"/>
                 <w:b w:val="0"/>
               </w:rPr>
+              <w:t>assets/images/scenes/polite_excuse_reassurance.jpg</w:t>
             </w:r>
           </w:p>
         </w:tc>
@@ -2986,7 +3113,7 @@
                 <w:rFonts w:ascii="Arial" w:hAnsi="Arial" w:eastAsia="Malgun Gothic"/>
                 <w:b w:val="0"/>
               </w:rPr>
-              <w:t>사진 필요</w:t>
+              <w:t>준비됨</w:t>
             </w:r>
           </w:p>
         </w:tc>
@@ -3064,7 +3191,7 @@
                 <w:rFonts w:ascii="Arial" w:hAnsi="Arial" w:eastAsia="Malgun Gothic"/>
                 <w:b w:val="0"/>
               </w:rPr>
-              <w:t>예배 후 처음 만나 이름을 묻고 자기소개하는 장면</w:t>
+              <w:t>교회 친교 자리에서 이름을 묻고 자기 이름을 소개하는 장면</w:t>
             </w:r>
           </w:p>
         </w:tc>
@@ -3102,7 +3229,7 @@
                 <w:rFonts w:ascii="Arial" w:hAnsi="Arial" w:eastAsia="Malgun Gothic"/>
                 <w:b w:val="0"/>
               </w:rPr>
-              <w:t>사진 필요</w:t>
+              <w:t>준비됨</w:t>
             </w:r>
           </w:p>
         </w:tc>
@@ -3180,7 +3307,7 @@
                 <w:rFonts w:ascii="Arial" w:hAnsi="Arial" w:eastAsia="Malgun Gothic"/>
                 <w:b w:val="0"/>
               </w:rPr>
-              <w:t>예배 후 처음 만나 이름을 묻고 자기소개하는 장면</w:t>
+              <w:t>교회 친교 자리에서 이름을 묻고 자기 이름을 소개하는 장면</w:t>
             </w:r>
           </w:p>
         </w:tc>
@@ -3218,7 +3345,7 @@
                 <w:rFonts w:ascii="Arial" w:hAnsi="Arial" w:eastAsia="Malgun Gothic"/>
                 <w:b w:val="0"/>
               </w:rPr>
-              <w:t>사진 필요</w:t>
+              <w:t>준비됨</w:t>
             </w:r>
           </w:p>
         </w:tc>
@@ -3296,7 +3423,7 @@
                 <w:rFonts w:ascii="Arial" w:hAnsi="Arial" w:eastAsia="Malgun Gothic"/>
                 <w:b w:val="0"/>
               </w:rPr>
-              <w:t>나이 묻기 학습 장면</w:t>
+              <w:t>교회 마당에서 어린이에게 나이를 조심스럽고 친근하게 묻는 장면</w:t>
             </w:r>
           </w:p>
         </w:tc>
@@ -3315,6 +3442,7 @@
                 <w:rFonts w:ascii="Arial" w:hAnsi="Arial" w:eastAsia="Malgun Gothic"/>
                 <w:b w:val="0"/>
               </w:rPr>
+              <w:t>assets/images/scenes/age_question_child.jpg</w:t>
             </w:r>
           </w:p>
         </w:tc>
@@ -3333,7 +3461,7 @@
                 <w:rFonts w:ascii="Arial" w:hAnsi="Arial" w:eastAsia="Malgun Gothic"/>
                 <w:b w:val="0"/>
               </w:rPr>
-              <w:t>사진 필요</w:t>
+              <w:t>준비됨</w:t>
             </w:r>
           </w:p>
         </w:tc>
@@ -3411,7 +3539,7 @@
                 <w:rFonts w:ascii="Arial" w:hAnsi="Arial" w:eastAsia="Malgun Gothic"/>
                 <w:b w:val="0"/>
               </w:rPr>
-              <w:t>교회 안에서 사랑과 축복의 말을 따뜻하게 전하는 장면</w:t>
+              <w:t>태국 교회 마당에서 공동체가 우리는 당신들을 사랑해요라고 따뜻하게 전하는 장면</w:t>
             </w:r>
           </w:p>
         </w:tc>
@@ -3430,7 +3558,7 @@
                 <w:rFonts w:ascii="Arial" w:hAnsi="Arial" w:eastAsia="Malgun Gothic"/>
                 <w:b w:val="0"/>
               </w:rPr>
-              <w:t>assets/images/scenes/encouragement_and_blessing.jpg</w:t>
+              <w:t>assets/images/scenes/we_love_you_group.jpg</w:t>
             </w:r>
           </w:p>
         </w:tc>
@@ -3449,7 +3577,7 @@
                 <w:rFonts w:ascii="Arial" w:hAnsi="Arial" w:eastAsia="Malgun Gothic"/>
                 <w:b w:val="0"/>
               </w:rPr>
-              <w:t>사진 필요</w:t>
+              <w:t>준비됨</w:t>
             </w:r>
           </w:p>
         </w:tc>
@@ -4801,7 +4929,7 @@
                 <w:rFonts w:ascii="Arial" w:hAnsi="Arial" w:eastAsia="Malgun Gothic"/>
                 <w:b w:val="0"/>
               </w:rPr>
-              <w:t>예배 후 처음 만나 이름을 묻고 자기소개하는 장면</w:t>
+              <w:t>교회 친교 자리에서 이름을 묻고 자기 이름을 소개하는 장면</w:t>
             </w:r>
           </w:p>
         </w:tc>
@@ -4839,7 +4967,7 @@
                 <w:rFonts w:ascii="Arial" w:hAnsi="Arial" w:eastAsia="Malgun Gothic"/>
                 <w:b w:val="0"/>
               </w:rPr>
-              <w:t>사진 필요</w:t>
+              <w:t>준비됨</w:t>
             </w:r>
           </w:p>
         </w:tc>
@@ -5381,7 +5509,7 @@
                 <w:rFonts w:ascii="Arial" w:hAnsi="Arial" w:eastAsia="Malgun Gothic"/>
                 <w:b w:val="0"/>
               </w:rPr>
-              <w:t>예배 후 처음 만나 이름을 묻고 자기소개하는 장면</w:t>
+              <w:t>교회 친교 자리에서 이름을 묻고 자기 이름을 소개하는 장면</w:t>
             </w:r>
           </w:p>
         </w:tc>
@@ -5419,7 +5547,7 @@
                 <w:rFonts w:ascii="Arial" w:hAnsi="Arial" w:eastAsia="Malgun Gothic"/>
                 <w:b w:val="0"/>
               </w:rPr>
-              <w:t>사진 필요</w:t>
+              <w:t>준비됨</w:t>
             </w:r>
           </w:p>
         </w:tc>

</xml_diff>

<commit_message>
Add day 9 age response lesson and image
</commit_message>
<xml_diff>
--- a/docs/thai_25day_image_sourcing_request.docx
+++ b/docs/thai_25day_image_sourcing_request.docx
@@ -21,7 +21,7 @@
         <w:rPr>
           <w:sz w:val="20"/>
         </w:rPr>
-        <w:t>작성일: 2026-06-26 | 용도: 평일 PWA/카카오 카드, 토요일 강의자료 이미지 수급</w:t>
+        <w:t>작성일: 2026-07-08 | 용도: 평일 PWA/카카오 카드, 토요일 강의자료 이미지 수급</w:t>
       </w:r>
     </w:p>
     <w:p>
@@ -1091,7 +1091,7 @@
                 <w:rFonts w:ascii="Arial" w:hAnsi="Arial" w:eastAsia="Malgun Gothic"/>
                 <w:b w:val="0"/>
               </w:rPr>
-              <w:t>age_question_child</w:t>
+              <w:t>howoldareyou</w:t>
             </w:r>
           </w:p>
         </w:tc>
@@ -1148,7 +1148,7 @@
                 <w:rFonts w:ascii="Arial" w:hAnsi="Arial" w:eastAsia="Malgun Gothic"/>
                 <w:b w:val="0"/>
               </w:rPr>
-              <w:t>assets/images/scenes/age_question_child.jpg</w:t>
+              <w:t>assets/images/scenes/howoldareyou.jpg</w:t>
             </w:r>
           </w:p>
         </w:tc>
@@ -3404,7 +3404,7 @@
                 <w:rFonts w:ascii="Arial" w:hAnsi="Arial" w:eastAsia="Malgun Gothic"/>
                 <w:b w:val="0"/>
               </w:rPr>
-              <w:t>나이 묻기</w:t>
+              <w:t>나이 묻고 답하기</w:t>
             </w:r>
           </w:p>
         </w:tc>
@@ -3442,7 +3442,7 @@
                 <w:rFonts w:ascii="Arial" w:hAnsi="Arial" w:eastAsia="Malgun Gothic"/>
                 <w:b w:val="0"/>
               </w:rPr>
-              <w:t>assets/images/scenes/age_question_child.jpg</w:t>
+              <w:t>assets/images/scenes/howoldareyou.jpg</w:t>
             </w:r>
           </w:p>
         </w:tc>
@@ -5258,7 +5258,7 @@
                 <w:rFonts w:ascii="Arial" w:hAnsi="Arial" w:eastAsia="Malgun Gothic"/>
                 <w:b w:val="0"/>
               </w:rPr>
-              <w:t>전체 24문장 종합 리허설</w:t>
+              <w:t>전체 문장 종합 리허설</w:t>
             </w:r>
           </w:p>
         </w:tc>
@@ -5838,7 +5838,7 @@
                 <w:rFonts w:ascii="Arial" w:hAnsi="Arial" w:eastAsia="Malgun Gothic"/>
                 <w:b w:val="0"/>
               </w:rPr>
-              <w:t>전체 24문장 종합 역할극</w:t>
+              <w:t>전체 문장 종합 역할극</w:t>
             </w:r>
           </w:p>
         </w:tc>

</xml_diff>

<commit_message>
Map day 11-20 lesson scene images
</commit_message>
<xml_diff>
--- a/docs/thai_25day_image_sourcing_request.docx
+++ b/docs/thai_25day_image_sourcing_request.docx
@@ -1407,7 +1407,7 @@
                 <w:rFonts w:ascii="Arial" w:hAnsi="Arial" w:eastAsia="Malgun Gothic"/>
                 <w:b w:val="0"/>
               </w:rPr>
-              <w:t>사진 필요</w:t>
+              <w:t>준비됨</w:t>
             </w:r>
           </w:p>
         </w:tc>
@@ -1426,9 +1426,11 @@
                 <w:rFonts w:ascii="Arial" w:hAnsi="Arial" w:eastAsia="Malgun Gothic"/>
                 <w:b w:val="0"/>
               </w:rPr>
-              <w:t>restroom sign clean hallway</w:t>
+              <w:t>church hallway restroom direction</w:t>
               <w:br/>
-              <w:t>bathroom direction sign public building</w:t>
+              <w:t>person asking where restroom is church</w:t>
+              <w:br/>
+              <w:t>friendly wayfinding in church building</w:t>
             </w:r>
           </w:p>
         </w:tc>
@@ -1468,7 +1470,7 @@
                 <w:rFonts w:ascii="Arial" w:hAnsi="Arial" w:eastAsia="Malgun Gothic"/>
                 <w:b w:val="0"/>
               </w:rPr>
-              <w:t>W3D12, W3D15, W3SAT</w:t>
+              <w:t>W3D12, W3SAT</w:t>
             </w:r>
           </w:p>
         </w:tc>
@@ -1525,7 +1527,7 @@
                 <w:rFonts w:ascii="Arial" w:hAnsi="Arial" w:eastAsia="Malgun Gothic"/>
                 <w:b w:val="0"/>
               </w:rPr>
-              <w:t>사진 필요</w:t>
+              <w:t>준비됨</w:t>
             </w:r>
           </w:p>
         </w:tc>
@@ -1544,11 +1546,11 @@
                 <w:rFonts w:ascii="Arial" w:hAnsi="Arial" w:eastAsia="Malgun Gothic"/>
                 <w:b w:val="0"/>
               </w:rPr>
-              <w:t>church meal table fellowship asian family style</w:t>
+              <w:t>church meal fellowship table Thailand</w:t>
               <w:br/>
-              <w:t>friends sharing meal smiling table</w:t>
+              <w:t>people sharing food church fellowship</w:t>
               <w:br/>
-              <w:t>community lunch church</w:t>
+              <w:t>warm community meal church</w:t>
             </w:r>
           </w:p>
         </w:tc>
@@ -1569,6 +1571,25 @@
                 <w:rFonts w:ascii="Arial" w:hAnsi="Arial" w:eastAsia="Malgun Gothic"/>
                 <w:b w:val="0"/>
               </w:rPr>
+              <w:t>encouraging_child_or_volunteer</w:t>
+            </w:r>
+          </w:p>
+        </w:tc>
+        <w:tc>
+          <w:tcPr>
+            <w:tcW w:type="dxa" w:w="1728"/>
+            <w:vAlign w:val="center"/>
+          </w:tcPr>
+          <w:p>
+            <w:pPr>
+              <w:spacing w:after="0"/>
+            </w:pPr>
+            <w:r/>
+            <w:r>
+              <w:rPr>
+                <w:rFonts w:ascii="Arial" w:hAnsi="Arial" w:eastAsia="Malgun Gothic"/>
+                <w:b w:val="0"/>
+              </w:rPr>
               <w:t>W3D13</w:t>
             </w:r>
           </w:p>
@@ -1588,7 +1609,7 @@
                 <w:rFonts w:ascii="Arial" w:hAnsi="Arial" w:eastAsia="Malgun Gothic"/>
                 <w:b w:val="0"/>
               </w:rPr>
-              <w:t>W3D13</w:t>
+              <w:t>교회 봉사나 활동 후 따뜻하게 잘했다고 격려하는 장면</w:t>
             </w:r>
           </w:p>
         </w:tc>
@@ -1607,7 +1628,7 @@
                 <w:rFonts w:ascii="Arial" w:hAnsi="Arial" w:eastAsia="Malgun Gothic"/>
                 <w:b w:val="0"/>
               </w:rPr>
-              <w:t>격려하기 학습 장면</w:t>
+              <w:t>assets/images/scenes/encouraging_child_or_volunteer.jpg</w:t>
             </w:r>
           </w:p>
         </w:tc>
@@ -1626,6 +1647,7 @@
                 <w:rFonts w:ascii="Arial" w:hAnsi="Arial" w:eastAsia="Malgun Gothic"/>
                 <w:b w:val="0"/>
               </w:rPr>
+              <w:t>준비됨</w:t>
             </w:r>
           </w:p>
         </w:tc>
@@ -1644,28 +1666,11 @@
                 <w:rFonts w:ascii="Arial" w:hAnsi="Arial" w:eastAsia="Malgun Gothic"/>
                 <w:b w:val="0"/>
               </w:rPr>
-              <w:t>사진 필요</w:t>
-            </w:r>
-          </w:p>
-        </w:tc>
-        <w:tc>
-          <w:tcPr>
-            <w:tcW w:type="dxa" w:w="1728"/>
-            <w:vAlign w:val="center"/>
-          </w:tcPr>
-          <w:p>
-            <w:pPr>
-              <w:spacing w:after="0"/>
-            </w:pPr>
-            <w:r/>
-            <w:r>
-              <w:rPr>
-                <w:rFonts w:ascii="Arial" w:hAnsi="Arial" w:eastAsia="Malgun Gothic"/>
-                <w:b w:val="0"/>
-              </w:rPr>
-              <w:t>격려하기</w:t>
+              <w:t>church volunteer encouragement good job</w:t>
               <w:br/>
-              <w:t>어린이와 봉사자를 향해 격려한다.</w:t>
+              <w:t>adult encouraging child church activity</w:t>
+              <w:br/>
+              <w:t>warm praise after volunteer work</w:t>
             </w:r>
           </w:p>
         </w:tc>
@@ -1686,6 +1691,25 @@
                 <w:rFonts w:ascii="Arial" w:hAnsi="Arial" w:eastAsia="Malgun Gothic"/>
                 <w:b w:val="0"/>
               </w:rPr>
+              <w:t>warm_church_farewell</w:t>
+            </w:r>
+          </w:p>
+        </w:tc>
+        <w:tc>
+          <w:tcPr>
+            <w:tcW w:type="dxa" w:w="1728"/>
+            <w:vAlign w:val="center"/>
+          </w:tcPr>
+          <w:p>
+            <w:pPr>
+              <w:spacing w:after="0"/>
+            </w:pPr>
+            <w:r/>
+            <w:r>
+              <w:rPr>
+                <w:rFonts w:ascii="Arial" w:hAnsi="Arial" w:eastAsia="Malgun Gothic"/>
+                <w:b w:val="0"/>
+              </w:rPr>
               <w:t>W3D14</w:t>
             </w:r>
           </w:p>
@@ -1705,7 +1729,7 @@
                 <w:rFonts w:ascii="Arial" w:hAnsi="Arial" w:eastAsia="Malgun Gothic"/>
                 <w:b w:val="0"/>
               </w:rPr>
-              <w:t>W3D14</w:t>
+              <w:t>교회 모임 후 따뜻하게 작별 인사를 나누는 장면</w:t>
             </w:r>
           </w:p>
         </w:tc>
@@ -1724,7 +1748,7 @@
                 <w:rFonts w:ascii="Arial" w:hAnsi="Arial" w:eastAsia="Malgun Gothic"/>
                 <w:b w:val="0"/>
               </w:rPr>
-              <w:t>작별 인사 학습 장면</w:t>
+              <w:t>assets/images/scenes/warm_church_farewell.jpg</w:t>
             </w:r>
           </w:p>
         </w:tc>
@@ -1743,6 +1767,7 @@
                 <w:rFonts w:ascii="Arial" w:hAnsi="Arial" w:eastAsia="Malgun Gothic"/>
                 <w:b w:val="0"/>
               </w:rPr>
+              <w:t>준비됨</w:t>
             </w:r>
           </w:p>
         </w:tc>
@@ -1761,28 +1786,11 @@
                 <w:rFonts w:ascii="Arial" w:hAnsi="Arial" w:eastAsia="Malgun Gothic"/>
                 <w:b w:val="0"/>
               </w:rPr>
-              <w:t>사진 필요</w:t>
-            </w:r>
-          </w:p>
-        </w:tc>
-        <w:tc>
-          <w:tcPr>
-            <w:tcW w:type="dxa" w:w="1728"/>
-            <w:vAlign w:val="center"/>
-          </w:tcPr>
-          <w:p>
-            <w:pPr>
-              <w:spacing w:after="0"/>
-            </w:pPr>
-            <w:r/>
-            <w:r>
-              <w:rPr>
-                <w:rFonts w:ascii="Arial" w:hAnsi="Arial" w:eastAsia="Malgun Gothic"/>
-                <w:b w:val="0"/>
-              </w:rPr>
-              <w:t>작별 인사</w:t>
+              <w:t>church farewell waving goodbye Thailand</w:t>
               <w:br/>
-              <w:t>식사와 행사가 끝난 뒤 자연스럽게 헤어진다.</w:t>
+              <w:t>warm goodbye after church meeting</w:t>
+              <w:br/>
+              <w:t>people saying see you again church</w:t>
             </w:r>
           </w:p>
         </w:tc>
@@ -1803,7 +1811,7 @@
                 <w:rFonts w:ascii="Arial" w:hAnsi="Arial" w:eastAsia="Malgun Gothic"/>
                 <w:b w:val="0"/>
               </w:rPr>
-              <w:t>encouragement_and_blessing</w:t>
+              <w:t>prayer_support</w:t>
             </w:r>
           </w:p>
         </w:tc>
@@ -1822,7 +1830,7 @@
                 <w:rFonts w:ascii="Arial" w:hAnsi="Arial" w:eastAsia="Malgun Gothic"/>
                 <w:b w:val="0"/>
               </w:rPr>
-              <w:t>W4D16, W4D17, W4D18, W4D19, W4SAT</w:t>
+              <w:t>W3D15, W5D23</w:t>
             </w:r>
           </w:p>
         </w:tc>
@@ -1841,7 +1849,7 @@
                 <w:rFonts w:ascii="Arial" w:hAnsi="Arial" w:eastAsia="Malgun Gothic"/>
                 <w:b w:val="0"/>
               </w:rPr>
-              <w:t>교회 안에서 사랑과 축복의 말을 따뜻하게 전하는 장면</w:t>
+              <w:t>상대의 이야기를 듣고 기도해 드리겠다고 따뜻하게 말하는 장면</w:t>
             </w:r>
           </w:p>
         </w:tc>
@@ -1860,7 +1868,7 @@
                 <w:rFonts w:ascii="Arial" w:hAnsi="Arial" w:eastAsia="Malgun Gothic"/>
                 <w:b w:val="0"/>
               </w:rPr>
-              <w:t>assets/images/scenes/encouragement_and_blessing.jpg</w:t>
+              <w:t>assets/images/scenes/prayer_support.jpg</w:t>
             </w:r>
           </w:p>
         </w:tc>
@@ -1879,7 +1887,7 @@
                 <w:rFonts w:ascii="Arial" w:hAnsi="Arial" w:eastAsia="Malgun Gothic"/>
                 <w:b w:val="0"/>
               </w:rPr>
-              <w:t>사진 필요</w:t>
+              <w:t>준비됨</w:t>
             </w:r>
           </w:p>
         </w:tc>
@@ -1898,11 +1906,11 @@
                 <w:rFonts w:ascii="Arial" w:hAnsi="Arial" w:eastAsia="Malgun Gothic"/>
                 <w:b w:val="0"/>
               </w:rPr>
-              <w:t>gentle church encouragement conversation</w:t>
+              <w:t>offering prayer support church conversation</w:t>
               <w:br/>
-              <w:t>supportive conversation church smiling</w:t>
+              <w:t>person listening and praying for friend church</w:t>
               <w:br/>
-              <w:t>blessing prayer church community</w:t>
+              <w:t>gentle prayer support conversation</w:t>
             </w:r>
           </w:p>
         </w:tc>
@@ -1923,6 +1931,486 @@
                 <w:rFonts w:ascii="Arial" w:hAnsi="Arial" w:eastAsia="Malgun Gothic"/>
                 <w:b w:val="0"/>
               </w:rPr>
+              <w:t>jesus_loves_you</w:t>
+            </w:r>
+          </w:p>
+        </w:tc>
+        <w:tc>
+          <w:tcPr>
+            <w:tcW w:type="dxa" w:w="1728"/>
+            <w:vAlign w:val="center"/>
+          </w:tcPr>
+          <w:p>
+            <w:pPr>
+              <w:spacing w:after="0"/>
+            </w:pPr>
+            <w:r/>
+            <w:r>
+              <w:rPr>
+                <w:rFonts w:ascii="Arial" w:hAnsi="Arial" w:eastAsia="Malgun Gothic"/>
+                <w:b w:val="0"/>
+              </w:rPr>
+              <w:t>W4D16</w:t>
+            </w:r>
+          </w:p>
+        </w:tc>
+        <w:tc>
+          <w:tcPr>
+            <w:tcW w:type="dxa" w:w="1728"/>
+            <w:vAlign w:val="center"/>
+          </w:tcPr>
+          <w:p>
+            <w:pPr>
+              <w:spacing w:after="0"/>
+            </w:pPr>
+            <w:r/>
+            <w:r>
+              <w:rPr>
+                <w:rFonts w:ascii="Arial" w:hAnsi="Arial" w:eastAsia="Malgun Gothic"/>
+                <w:b w:val="0"/>
+              </w:rPr>
+              <w:t>예수님이 당신을 사랑하신다고 따뜻하게 전하는 장면</w:t>
+            </w:r>
+          </w:p>
+        </w:tc>
+        <w:tc>
+          <w:tcPr>
+            <w:tcW w:type="dxa" w:w="1728"/>
+            <w:vAlign w:val="center"/>
+          </w:tcPr>
+          <w:p>
+            <w:pPr>
+              <w:spacing w:after="0"/>
+            </w:pPr>
+            <w:r/>
+            <w:r>
+              <w:rPr>
+                <w:rFonts w:ascii="Arial" w:hAnsi="Arial" w:eastAsia="Malgun Gothic"/>
+                <w:b w:val="0"/>
+              </w:rPr>
+              <w:t>assets/images/scenes/jesus_loves_you.jpg</w:t>
+            </w:r>
+          </w:p>
+        </w:tc>
+        <w:tc>
+          <w:tcPr>
+            <w:tcW w:type="dxa" w:w="1728"/>
+            <w:vAlign w:val="center"/>
+          </w:tcPr>
+          <w:p>
+            <w:pPr>
+              <w:spacing w:after="0"/>
+            </w:pPr>
+            <w:r/>
+            <w:r>
+              <w:rPr>
+                <w:rFonts w:ascii="Arial" w:hAnsi="Arial" w:eastAsia="Malgun Gothic"/>
+                <w:b w:val="0"/>
+              </w:rPr>
+              <w:t>준비됨</w:t>
+            </w:r>
+          </w:p>
+        </w:tc>
+        <w:tc>
+          <w:tcPr>
+            <w:tcW w:type="dxa" w:w="1728"/>
+            <w:vAlign w:val="center"/>
+          </w:tcPr>
+          <w:p>
+            <w:pPr>
+              <w:spacing w:after="0"/>
+            </w:pPr>
+            <w:r/>
+            <w:r>
+              <w:rPr>
+                <w:rFonts w:ascii="Arial" w:hAnsi="Arial" w:eastAsia="Malgun Gothic"/>
+                <w:b w:val="0"/>
+              </w:rPr>
+              <w:t>Jesus loves you warm church conversation</w:t>
+              <w:br/>
+              <w:t>mission team sharing Jesus love Thailand</w:t>
+              <w:br/>
+              <w:t>gentle gospel conversation church</w:t>
+            </w:r>
+          </w:p>
+        </w:tc>
+      </w:tr>
+      <w:tr>
+        <w:tc>
+          <w:tcPr>
+            <w:tcW w:type="dxa" w:w="1728"/>
+            <w:vAlign w:val="center"/>
+          </w:tcPr>
+          <w:p>
+            <w:pPr>
+              <w:spacing w:after="0"/>
+            </w:pPr>
+            <w:r/>
+            <w:r>
+              <w:rPr>
+                <w:rFonts w:ascii="Arial" w:hAnsi="Arial" w:eastAsia="Malgun Gothic"/>
+                <w:b w:val="0"/>
+              </w:rPr>
+              <w:t>god_loves_you</w:t>
+            </w:r>
+          </w:p>
+        </w:tc>
+        <w:tc>
+          <w:tcPr>
+            <w:tcW w:type="dxa" w:w="1728"/>
+            <w:vAlign w:val="center"/>
+          </w:tcPr>
+          <w:p>
+            <w:pPr>
+              <w:spacing w:after="0"/>
+            </w:pPr>
+            <w:r/>
+            <w:r>
+              <w:rPr>
+                <w:rFonts w:ascii="Arial" w:hAnsi="Arial" w:eastAsia="Malgun Gothic"/>
+                <w:b w:val="0"/>
+              </w:rPr>
+              <w:t>W4D17</w:t>
+            </w:r>
+          </w:p>
+        </w:tc>
+        <w:tc>
+          <w:tcPr>
+            <w:tcW w:type="dxa" w:w="1728"/>
+            <w:vAlign w:val="center"/>
+          </w:tcPr>
+          <w:p>
+            <w:pPr>
+              <w:spacing w:after="0"/>
+            </w:pPr>
+            <w:r/>
+            <w:r>
+              <w:rPr>
+                <w:rFonts w:ascii="Arial" w:hAnsi="Arial" w:eastAsia="Malgun Gothic"/>
+                <w:b w:val="0"/>
+              </w:rPr>
+              <w:t>하나님이 당신을 사랑하신다고 따뜻하게 전하는 장면</w:t>
+            </w:r>
+          </w:p>
+        </w:tc>
+        <w:tc>
+          <w:tcPr>
+            <w:tcW w:type="dxa" w:w="1728"/>
+            <w:vAlign w:val="center"/>
+          </w:tcPr>
+          <w:p>
+            <w:pPr>
+              <w:spacing w:after="0"/>
+            </w:pPr>
+            <w:r/>
+            <w:r>
+              <w:rPr>
+                <w:rFonts w:ascii="Arial" w:hAnsi="Arial" w:eastAsia="Malgun Gothic"/>
+                <w:b w:val="0"/>
+              </w:rPr>
+              <w:t>assets/images/scenes/god_loves_you.jpg</w:t>
+            </w:r>
+          </w:p>
+        </w:tc>
+        <w:tc>
+          <w:tcPr>
+            <w:tcW w:type="dxa" w:w="1728"/>
+            <w:vAlign w:val="center"/>
+          </w:tcPr>
+          <w:p>
+            <w:pPr>
+              <w:spacing w:after="0"/>
+            </w:pPr>
+            <w:r/>
+            <w:r>
+              <w:rPr>
+                <w:rFonts w:ascii="Arial" w:hAnsi="Arial" w:eastAsia="Malgun Gothic"/>
+                <w:b w:val="0"/>
+              </w:rPr>
+              <w:t>준비됨</w:t>
+            </w:r>
+          </w:p>
+        </w:tc>
+        <w:tc>
+          <w:tcPr>
+            <w:tcW w:type="dxa" w:w="1728"/>
+            <w:vAlign w:val="center"/>
+          </w:tcPr>
+          <w:p>
+            <w:pPr>
+              <w:spacing w:after="0"/>
+            </w:pPr>
+            <w:r/>
+            <w:r>
+              <w:rPr>
+                <w:rFonts w:ascii="Arial" w:hAnsi="Arial" w:eastAsia="Malgun Gothic"/>
+                <w:b w:val="0"/>
+              </w:rPr>
+              <w:t>God loves you church conversation</w:t>
+              <w:br/>
+              <w:t>sharing God loves you warm mission conversation</w:t>
+              <w:br/>
+              <w:t>Thai church visitor hearing God loves you</w:t>
+            </w:r>
+          </w:p>
+        </w:tc>
+      </w:tr>
+      <w:tr>
+        <w:tc>
+          <w:tcPr>
+            <w:tcW w:type="dxa" w:w="1728"/>
+            <w:vAlign w:val="center"/>
+          </w:tcPr>
+          <w:p>
+            <w:pPr>
+              <w:spacing w:after="0"/>
+            </w:pPr>
+            <w:r/>
+            <w:r>
+              <w:rPr>
+                <w:rFonts w:ascii="Arial" w:hAnsi="Arial" w:eastAsia="Malgun Gothic"/>
+                <w:b w:val="0"/>
+              </w:rPr>
+              <w:t>god_bless_you</w:t>
+            </w:r>
+          </w:p>
+        </w:tc>
+        <w:tc>
+          <w:tcPr>
+            <w:tcW w:type="dxa" w:w="1728"/>
+            <w:vAlign w:val="center"/>
+          </w:tcPr>
+          <w:p>
+            <w:pPr>
+              <w:spacing w:after="0"/>
+            </w:pPr>
+            <w:r/>
+            <w:r>
+              <w:rPr>
+                <w:rFonts w:ascii="Arial" w:hAnsi="Arial" w:eastAsia="Malgun Gothic"/>
+                <w:b w:val="0"/>
+              </w:rPr>
+              <w:t>W4D18, W4SAT</w:t>
+            </w:r>
+          </w:p>
+        </w:tc>
+        <w:tc>
+          <w:tcPr>
+            <w:tcW w:type="dxa" w:w="1728"/>
+            <w:vAlign w:val="center"/>
+          </w:tcPr>
+          <w:p>
+            <w:pPr>
+              <w:spacing w:after="0"/>
+            </w:pPr>
+            <w:r/>
+            <w:r>
+              <w:rPr>
+                <w:rFonts w:ascii="Arial" w:hAnsi="Arial" w:eastAsia="Malgun Gothic"/>
+                <w:b w:val="0"/>
+              </w:rPr>
+              <w:t>하나님의 축복을 전하며 따뜻하게 격려하는 장면</w:t>
+            </w:r>
+          </w:p>
+        </w:tc>
+        <w:tc>
+          <w:tcPr>
+            <w:tcW w:type="dxa" w:w="1728"/>
+            <w:vAlign w:val="center"/>
+          </w:tcPr>
+          <w:p>
+            <w:pPr>
+              <w:spacing w:after="0"/>
+            </w:pPr>
+            <w:r/>
+            <w:r>
+              <w:rPr>
+                <w:rFonts w:ascii="Arial" w:hAnsi="Arial" w:eastAsia="Malgun Gothic"/>
+                <w:b w:val="0"/>
+              </w:rPr>
+              <w:t>assets/images/scenes/god_bless_you.jpg</w:t>
+            </w:r>
+          </w:p>
+        </w:tc>
+        <w:tc>
+          <w:tcPr>
+            <w:tcW w:type="dxa" w:w="1728"/>
+            <w:vAlign w:val="center"/>
+          </w:tcPr>
+          <w:p>
+            <w:pPr>
+              <w:spacing w:after="0"/>
+            </w:pPr>
+            <w:r/>
+            <w:r>
+              <w:rPr>
+                <w:rFonts w:ascii="Arial" w:hAnsi="Arial" w:eastAsia="Malgun Gothic"/>
+                <w:b w:val="0"/>
+              </w:rPr>
+              <w:t>준비됨</w:t>
+            </w:r>
+          </w:p>
+        </w:tc>
+        <w:tc>
+          <w:tcPr>
+            <w:tcW w:type="dxa" w:w="1728"/>
+            <w:vAlign w:val="center"/>
+          </w:tcPr>
+          <w:p>
+            <w:pPr>
+              <w:spacing w:after="0"/>
+            </w:pPr>
+            <w:r/>
+            <w:r>
+              <w:rPr>
+                <w:rFonts w:ascii="Arial" w:hAnsi="Arial" w:eastAsia="Malgun Gothic"/>
+                <w:b w:val="0"/>
+              </w:rPr>
+              <w:t>God bless you church blessing conversation</w:t>
+              <w:br/>
+              <w:t>warm blessing prayer church Thailand</w:t>
+              <w:br/>
+              <w:t>mission team blessing local church member</w:t>
+            </w:r>
+          </w:p>
+        </w:tc>
+      </w:tr>
+      <w:tr>
+        <w:tc>
+          <w:tcPr>
+            <w:tcW w:type="dxa" w:w="1728"/>
+            <w:vAlign w:val="center"/>
+          </w:tcPr>
+          <w:p>
+            <w:pPr>
+              <w:spacing w:after="0"/>
+            </w:pPr>
+            <w:r/>
+            <w:r>
+              <w:rPr>
+                <w:rFonts w:ascii="Arial" w:hAnsi="Arial" w:eastAsia="Malgun Gothic"/>
+                <w:b w:val="0"/>
+              </w:rPr>
+              <w:t>god_is_love</w:t>
+            </w:r>
+          </w:p>
+        </w:tc>
+        <w:tc>
+          <w:tcPr>
+            <w:tcW w:type="dxa" w:w="1728"/>
+            <w:vAlign w:val="center"/>
+          </w:tcPr>
+          <w:p>
+            <w:pPr>
+              <w:spacing w:after="0"/>
+            </w:pPr>
+            <w:r/>
+            <w:r>
+              <w:rPr>
+                <w:rFonts w:ascii="Arial" w:hAnsi="Arial" w:eastAsia="Malgun Gothic"/>
+                <w:b w:val="0"/>
+              </w:rPr>
+              <w:t>W4D19</w:t>
+            </w:r>
+          </w:p>
+        </w:tc>
+        <w:tc>
+          <w:tcPr>
+            <w:tcW w:type="dxa" w:w="1728"/>
+            <w:vAlign w:val="center"/>
+          </w:tcPr>
+          <w:p>
+            <w:pPr>
+              <w:spacing w:after="0"/>
+            </w:pPr>
+            <w:r/>
+            <w:r>
+              <w:rPr>
+                <w:rFonts w:ascii="Arial" w:hAnsi="Arial" w:eastAsia="Malgun Gothic"/>
+                <w:b w:val="0"/>
+              </w:rPr>
+              <w:t>하나님은 사랑이십니다라는 핵심 메시지를 차분히 나누는 장면</w:t>
+            </w:r>
+          </w:p>
+        </w:tc>
+        <w:tc>
+          <w:tcPr>
+            <w:tcW w:type="dxa" w:w="1728"/>
+            <w:vAlign w:val="center"/>
+          </w:tcPr>
+          <w:p>
+            <w:pPr>
+              <w:spacing w:after="0"/>
+            </w:pPr>
+            <w:r/>
+            <w:r>
+              <w:rPr>
+                <w:rFonts w:ascii="Arial" w:hAnsi="Arial" w:eastAsia="Malgun Gothic"/>
+                <w:b w:val="0"/>
+              </w:rPr>
+              <w:t>assets/images/scenes/god_is_love.jpg</w:t>
+            </w:r>
+          </w:p>
+        </w:tc>
+        <w:tc>
+          <w:tcPr>
+            <w:tcW w:type="dxa" w:w="1728"/>
+            <w:vAlign w:val="center"/>
+          </w:tcPr>
+          <w:p>
+            <w:pPr>
+              <w:spacing w:after="0"/>
+            </w:pPr>
+            <w:r/>
+            <w:r>
+              <w:rPr>
+                <w:rFonts w:ascii="Arial" w:hAnsi="Arial" w:eastAsia="Malgun Gothic"/>
+                <w:b w:val="0"/>
+              </w:rPr>
+              <w:t>준비됨</w:t>
+            </w:r>
+          </w:p>
+        </w:tc>
+        <w:tc>
+          <w:tcPr>
+            <w:tcW w:type="dxa" w:w="1728"/>
+            <w:vAlign w:val="center"/>
+          </w:tcPr>
+          <w:p>
+            <w:pPr>
+              <w:spacing w:after="0"/>
+            </w:pPr>
+            <w:r/>
+            <w:r>
+              <w:rPr>
+                <w:rFonts w:ascii="Arial" w:hAnsi="Arial" w:eastAsia="Malgun Gothic"/>
+                <w:b w:val="0"/>
+              </w:rPr>
+              <w:t>God is love small church conversation</w:t>
+              <w:br/>
+              <w:t>sharing Bible message God is love</w:t>
+              <w:br/>
+              <w:t>peaceful gospel conversation church</w:t>
+            </w:r>
+          </w:p>
+        </w:tc>
+      </w:tr>
+      <w:tr>
+        <w:tc>
+          <w:tcPr>
+            <w:tcW w:type="dxa" w:w="1728"/>
+            <w:vAlign w:val="center"/>
+          </w:tcPr>
+          <w:p>
+            <w:pPr>
+              <w:spacing w:after="0"/>
+            </w:pPr>
+            <w:r/>
+            <w:r>
+              <w:rPr>
+                <w:rFonts w:ascii="Arial" w:hAnsi="Arial" w:eastAsia="Malgun Gothic"/>
+                <w:b w:val="0"/>
+              </w:rPr>
               <w:t>praise_invitation</w:t>
             </w:r>
           </w:p>
@@ -1999,7 +2487,7 @@
                 <w:rFonts w:ascii="Arial" w:hAnsi="Arial" w:eastAsia="Malgun Gothic"/>
                 <w:b w:val="0"/>
               </w:rPr>
-              <w:t>사진 필요</w:t>
+              <w:t>준비됨</w:t>
             </w:r>
           </w:p>
         </w:tc>
@@ -2023,124 +2511,6 @@
               <w:t>church worship small group joyful singing</w:t>
               <w:br/>
               <w:t>community praise gathering</w:t>
-            </w:r>
-          </w:p>
-        </w:tc>
-      </w:tr>
-      <w:tr>
-        <w:tc>
-          <w:tcPr>
-            <w:tcW w:type="dxa" w:w="1728"/>
-            <w:vAlign w:val="center"/>
-          </w:tcPr>
-          <w:p>
-            <w:pPr>
-              <w:spacing w:after="0"/>
-            </w:pPr>
-            <w:r/>
-            <w:r>
-              <w:rPr>
-                <w:rFonts w:ascii="Arial" w:hAnsi="Arial" w:eastAsia="Malgun Gothic"/>
-                <w:b w:val="0"/>
-              </w:rPr>
-              <w:t>prayer_support</w:t>
-            </w:r>
-          </w:p>
-        </w:tc>
-        <w:tc>
-          <w:tcPr>
-            <w:tcW w:type="dxa" w:w="1728"/>
-            <w:vAlign w:val="center"/>
-          </w:tcPr>
-          <w:p>
-            <w:pPr>
-              <w:spacing w:after="0"/>
-            </w:pPr>
-            <w:r/>
-            <w:r>
-              <w:rPr>
-                <w:rFonts w:ascii="Arial" w:hAnsi="Arial" w:eastAsia="Malgun Gothic"/>
-                <w:b w:val="0"/>
-              </w:rPr>
-              <w:t>W5D23</w:t>
-            </w:r>
-          </w:p>
-        </w:tc>
-        <w:tc>
-          <w:tcPr>
-            <w:tcW w:type="dxa" w:w="1728"/>
-            <w:vAlign w:val="center"/>
-          </w:tcPr>
-          <w:p>
-            <w:pPr>
-              <w:spacing w:after="0"/>
-            </w:pPr>
-            <w:r/>
-            <w:r>
-              <w:rPr>
-                <w:rFonts w:ascii="Arial" w:hAnsi="Arial" w:eastAsia="Malgun Gothic"/>
-                <w:b w:val="0"/>
-              </w:rPr>
-              <w:t>상대를 위로하며 기도해 주겠다고 말하는 장면</w:t>
-            </w:r>
-          </w:p>
-        </w:tc>
-        <w:tc>
-          <w:tcPr>
-            <w:tcW w:type="dxa" w:w="1728"/>
-            <w:vAlign w:val="center"/>
-          </w:tcPr>
-          <w:p>
-            <w:pPr>
-              <w:spacing w:after="0"/>
-            </w:pPr>
-            <w:r/>
-            <w:r>
-              <w:rPr>
-                <w:rFonts w:ascii="Arial" w:hAnsi="Arial" w:eastAsia="Malgun Gothic"/>
-                <w:b w:val="0"/>
-              </w:rPr>
-              <w:t>assets/images/scenes/prayer_support.jpg</w:t>
-            </w:r>
-          </w:p>
-        </w:tc>
-        <w:tc>
-          <w:tcPr>
-            <w:tcW w:type="dxa" w:w="1728"/>
-            <w:vAlign w:val="center"/>
-          </w:tcPr>
-          <w:p>
-            <w:pPr>
-              <w:spacing w:after="0"/>
-            </w:pPr>
-            <w:r/>
-            <w:r>
-              <w:rPr>
-                <w:rFonts w:ascii="Arial" w:hAnsi="Arial" w:eastAsia="Malgun Gothic"/>
-                <w:b w:val="0"/>
-              </w:rPr>
-              <w:t>사진 필요</w:t>
-            </w:r>
-          </w:p>
-        </w:tc>
-        <w:tc>
-          <w:tcPr>
-            <w:tcW w:type="dxa" w:w="1728"/>
-            <w:vAlign w:val="center"/>
-          </w:tcPr>
-          <w:p>
-            <w:pPr>
-              <w:spacing w:after="0"/>
-            </w:pPr>
-            <w:r/>
-            <w:r>
-              <w:rPr>
-                <w:rFonts w:ascii="Arial" w:hAnsi="Arial" w:eastAsia="Malgun Gothic"/>
-                <w:b w:val="0"/>
-              </w:rPr>
-              <w:t>prayer support two people church</w:t>
-              <w:br/>
-              <w:t>gentle prayer with friend church</w:t>
             </w:r>
           </w:p>
         </w:tc>
@@ -3693,7 +4063,7 @@
                 <w:rFonts w:ascii="Arial" w:hAnsi="Arial" w:eastAsia="Malgun Gothic"/>
                 <w:b w:val="0"/>
               </w:rPr>
-              <w:t>사진 필요</w:t>
+              <w:t>준비됨</w:t>
             </w:r>
           </w:p>
         </w:tc>
@@ -3809,7 +4179,7 @@
                 <w:rFonts w:ascii="Arial" w:hAnsi="Arial" w:eastAsia="Malgun Gothic"/>
                 <w:b w:val="0"/>
               </w:rPr>
-              <w:t>사진 필요</w:t>
+              <w:t>준비됨</w:t>
             </w:r>
           </w:p>
         </w:tc>
@@ -3887,7 +4257,7 @@
                 <w:rFonts w:ascii="Arial" w:hAnsi="Arial" w:eastAsia="Malgun Gothic"/>
                 <w:b w:val="0"/>
               </w:rPr>
-              <w:t>격려하기 학습 장면</w:t>
+              <w:t>교회 봉사나 활동 후 따뜻하게 잘했다고 격려하는 장면</w:t>
             </w:r>
           </w:p>
         </w:tc>
@@ -3906,6 +4276,7 @@
                 <w:rFonts w:ascii="Arial" w:hAnsi="Arial" w:eastAsia="Malgun Gothic"/>
                 <w:b w:val="0"/>
               </w:rPr>
+              <w:t>assets/images/scenes/encouraging_child_or_volunteer.jpg</w:t>
             </w:r>
           </w:p>
         </w:tc>
@@ -3924,7 +4295,7 @@
                 <w:rFonts w:ascii="Arial" w:hAnsi="Arial" w:eastAsia="Malgun Gothic"/>
                 <w:b w:val="0"/>
               </w:rPr>
-              <w:t>사진 필요</w:t>
+              <w:t>준비됨</w:t>
             </w:r>
           </w:p>
         </w:tc>
@@ -4002,7 +4373,7 @@
                 <w:rFonts w:ascii="Arial" w:hAnsi="Arial" w:eastAsia="Malgun Gothic"/>
                 <w:b w:val="0"/>
               </w:rPr>
-              <w:t>작별 인사 학습 장면</w:t>
+              <w:t>교회 모임 후 따뜻하게 작별 인사를 나누는 장면</w:t>
             </w:r>
           </w:p>
         </w:tc>
@@ -4021,6 +4392,7 @@
                 <w:rFonts w:ascii="Arial" w:hAnsi="Arial" w:eastAsia="Malgun Gothic"/>
                 <w:b w:val="0"/>
               </w:rPr>
+              <w:t>assets/images/scenes/warm_church_farewell.jpg</w:t>
             </w:r>
           </w:p>
         </w:tc>
@@ -4039,7 +4411,7 @@
                 <w:rFonts w:ascii="Arial" w:hAnsi="Arial" w:eastAsia="Malgun Gothic"/>
                 <w:b w:val="0"/>
               </w:rPr>
-              <w:t>사진 필요</w:t>
+              <w:t>준비됨</w:t>
             </w:r>
           </w:p>
         </w:tc>
@@ -4117,7 +4489,7 @@
                 <w:rFonts w:ascii="Arial" w:hAnsi="Arial" w:eastAsia="Malgun Gothic"/>
                 <w:b w:val="0"/>
               </w:rPr>
-              <w:t>교회 식사 자리에서 음식을 나누며 대화하는 장면</w:t>
+              <w:t>상대의 이야기를 듣고 기도해 드리겠다고 따뜻하게 말하는 장면</w:t>
             </w:r>
           </w:p>
         </w:tc>
@@ -4136,7 +4508,7 @@
                 <w:rFonts w:ascii="Arial" w:hAnsi="Arial" w:eastAsia="Malgun Gothic"/>
                 <w:b w:val="0"/>
               </w:rPr>
-              <w:t>assets/images/scenes/meal_table_fellowship.jpg</w:t>
+              <w:t>assets/images/scenes/prayer_support.jpg</w:t>
             </w:r>
           </w:p>
         </w:tc>
@@ -4155,7 +4527,7 @@
                 <w:rFonts w:ascii="Arial" w:hAnsi="Arial" w:eastAsia="Malgun Gothic"/>
                 <w:b w:val="0"/>
               </w:rPr>
-              <w:t>사진 필요</w:t>
+              <w:t>준비됨</w:t>
             </w:r>
           </w:p>
         </w:tc>
@@ -4233,7 +4605,7 @@
                 <w:rFonts w:ascii="Arial" w:hAnsi="Arial" w:eastAsia="Malgun Gothic"/>
                 <w:b w:val="0"/>
               </w:rPr>
-              <w:t>교회 안에서 사랑과 축복의 말을 따뜻하게 전하는 장면</w:t>
+              <w:t>예수님이 당신을 사랑하신다고 따뜻하게 전하는 장면</w:t>
             </w:r>
           </w:p>
         </w:tc>
@@ -4252,7 +4624,7 @@
                 <w:rFonts w:ascii="Arial" w:hAnsi="Arial" w:eastAsia="Malgun Gothic"/>
                 <w:b w:val="0"/>
               </w:rPr>
-              <w:t>assets/images/scenes/encouragement_and_blessing.jpg</w:t>
+              <w:t>assets/images/scenes/jesus_loves_you.jpg</w:t>
             </w:r>
           </w:p>
         </w:tc>
@@ -4271,7 +4643,7 @@
                 <w:rFonts w:ascii="Arial" w:hAnsi="Arial" w:eastAsia="Malgun Gothic"/>
                 <w:b w:val="0"/>
               </w:rPr>
-              <w:t>사진 필요</w:t>
+              <w:t>준비됨</w:t>
             </w:r>
           </w:p>
         </w:tc>
@@ -4349,7 +4721,7 @@
                 <w:rFonts w:ascii="Arial" w:hAnsi="Arial" w:eastAsia="Malgun Gothic"/>
                 <w:b w:val="0"/>
               </w:rPr>
-              <w:t>교회 안에서 사랑과 축복의 말을 따뜻하게 전하는 장면</w:t>
+              <w:t>하나님이 당신을 사랑하신다고 따뜻하게 전하는 장면</w:t>
             </w:r>
           </w:p>
         </w:tc>
@@ -4368,7 +4740,7 @@
                 <w:rFonts w:ascii="Arial" w:hAnsi="Arial" w:eastAsia="Malgun Gothic"/>
                 <w:b w:val="0"/>
               </w:rPr>
-              <w:t>assets/images/scenes/encouragement_and_blessing.jpg</w:t>
+              <w:t>assets/images/scenes/god_loves_you.jpg</w:t>
             </w:r>
           </w:p>
         </w:tc>
@@ -4387,7 +4759,7 @@
                 <w:rFonts w:ascii="Arial" w:hAnsi="Arial" w:eastAsia="Malgun Gothic"/>
                 <w:b w:val="0"/>
               </w:rPr>
-              <w:t>사진 필요</w:t>
+              <w:t>준비됨</w:t>
             </w:r>
           </w:p>
         </w:tc>
@@ -4465,7 +4837,7 @@
                 <w:rFonts w:ascii="Arial" w:hAnsi="Arial" w:eastAsia="Malgun Gothic"/>
                 <w:b w:val="0"/>
               </w:rPr>
-              <w:t>교회 안에서 사랑과 축복의 말을 따뜻하게 전하는 장면</w:t>
+              <w:t>하나님의 축복을 전하며 따뜻하게 격려하는 장면</w:t>
             </w:r>
           </w:p>
         </w:tc>
@@ -4484,7 +4856,7 @@
                 <w:rFonts w:ascii="Arial" w:hAnsi="Arial" w:eastAsia="Malgun Gothic"/>
                 <w:b w:val="0"/>
               </w:rPr>
-              <w:t>assets/images/scenes/encouragement_and_blessing.jpg</w:t>
+              <w:t>assets/images/scenes/god_bless_you.jpg</w:t>
             </w:r>
           </w:p>
         </w:tc>
@@ -4503,7 +4875,7 @@
                 <w:rFonts w:ascii="Arial" w:hAnsi="Arial" w:eastAsia="Malgun Gothic"/>
                 <w:b w:val="0"/>
               </w:rPr>
-              <w:t>사진 필요</w:t>
+              <w:t>준비됨</w:t>
             </w:r>
           </w:p>
         </w:tc>
@@ -4581,7 +4953,7 @@
                 <w:rFonts w:ascii="Arial" w:hAnsi="Arial" w:eastAsia="Malgun Gothic"/>
                 <w:b w:val="0"/>
               </w:rPr>
-              <w:t>교회 안에서 사랑과 축복의 말을 따뜻하게 전하는 장면</w:t>
+              <w:t>하나님은 사랑이십니다라는 핵심 메시지를 차분히 나누는 장면</w:t>
             </w:r>
           </w:p>
         </w:tc>
@@ -4600,7 +4972,7 @@
                 <w:rFonts w:ascii="Arial" w:hAnsi="Arial" w:eastAsia="Malgun Gothic"/>
                 <w:b w:val="0"/>
               </w:rPr>
-              <w:t>assets/images/scenes/encouragement_and_blessing.jpg</w:t>
+              <w:t>assets/images/scenes/god_is_love.jpg</w:t>
             </w:r>
           </w:p>
         </w:tc>
@@ -4619,7 +4991,7 @@
                 <w:rFonts w:ascii="Arial" w:hAnsi="Arial" w:eastAsia="Malgun Gothic"/>
                 <w:b w:val="0"/>
               </w:rPr>
-              <w:t>사진 필요</w:t>
+              <w:t>준비됨</w:t>
             </w:r>
           </w:p>
         </w:tc>
@@ -4735,7 +5107,7 @@
                 <w:rFonts w:ascii="Arial" w:hAnsi="Arial" w:eastAsia="Malgun Gothic"/>
                 <w:b w:val="0"/>
               </w:rPr>
-              <w:t>사진 필요</w:t>
+              <w:t>준비됨</w:t>
             </w:r>
           </w:p>
         </w:tc>
@@ -5045,7 +5417,7 @@
                 <w:rFonts w:ascii="Arial" w:hAnsi="Arial" w:eastAsia="Malgun Gothic"/>
                 <w:b w:val="0"/>
               </w:rPr>
-              <w:t>상대를 위로하며 기도해 주겠다고 말하는 장면</w:t>
+              <w:t>상대의 이야기를 듣고 기도해 드리겠다고 따뜻하게 말하는 장면</w:t>
             </w:r>
           </w:p>
         </w:tc>
@@ -5083,7 +5455,7 @@
                 <w:rFonts w:ascii="Arial" w:hAnsi="Arial" w:eastAsia="Malgun Gothic"/>
                 <w:b w:val="0"/>
               </w:rPr>
-              <w:t>사진 필요</w:t>
+              <w:t>준비됨</w:t>
             </w:r>
           </w:p>
         </w:tc>
@@ -5199,7 +5571,7 @@
                 <w:rFonts w:ascii="Arial" w:hAnsi="Arial" w:eastAsia="Malgun Gothic"/>
                 <w:b w:val="0"/>
               </w:rPr>
-              <w:t>사진 필요</w:t>
+              <w:t>준비됨</w:t>
             </w:r>
           </w:p>
         </w:tc>
@@ -5663,7 +6035,7 @@
                 <w:rFonts w:ascii="Arial" w:hAnsi="Arial" w:eastAsia="Malgun Gothic"/>
                 <w:b w:val="0"/>
               </w:rPr>
-              <w:t>사진 필요</w:t>
+              <w:t>준비됨</w:t>
             </w:r>
           </w:p>
         </w:tc>
@@ -5741,7 +6113,7 @@
                 <w:rFonts w:ascii="Arial" w:hAnsi="Arial" w:eastAsia="Malgun Gothic"/>
                 <w:b w:val="0"/>
               </w:rPr>
-              <w:t>교회 안에서 사랑과 축복의 말을 따뜻하게 전하는 장면</w:t>
+              <w:t>하나님의 축복을 전하며 따뜻하게 격려하는 장면</w:t>
             </w:r>
           </w:p>
         </w:tc>
@@ -5760,7 +6132,7 @@
                 <w:rFonts w:ascii="Arial" w:hAnsi="Arial" w:eastAsia="Malgun Gothic"/>
                 <w:b w:val="0"/>
               </w:rPr>
-              <w:t>assets/images/scenes/encouragement_and_blessing.jpg</w:t>
+              <w:t>assets/images/scenes/god_bless_you.jpg</w:t>
             </w:r>
           </w:p>
         </w:tc>
@@ -5779,7 +6151,7 @@
                 <w:rFonts w:ascii="Arial" w:hAnsi="Arial" w:eastAsia="Malgun Gothic"/>
                 <w:b w:val="0"/>
               </w:rPr>
-              <w:t>사진 필요</w:t>
+              <w:t>준비됨</w:t>
             </w:r>
           </w:p>
         </w:tc>

</xml_diff>

<commit_message>
Align weekend reviews and verify day 11-20 assets
</commit_message>
<xml_diff>
--- a/docs/thai_25day_image_sourcing_request.docx
+++ b/docs/thai_25day_image_sourcing_request.docx
@@ -1470,7 +1470,7 @@
                 <w:rFonts w:ascii="Arial" w:hAnsi="Arial" w:eastAsia="Malgun Gothic"/>
                 <w:b w:val="0"/>
               </w:rPr>
-              <w:t>W3D12, W3SAT</w:t>
+              <w:t>W3D12</w:t>
             </w:r>
           </w:p>
         </w:tc>
@@ -1830,7 +1830,7 @@
                 <w:rFonts w:ascii="Arial" w:hAnsi="Arial" w:eastAsia="Malgun Gothic"/>
                 <w:b w:val="0"/>
               </w:rPr>
-              <w:t>W3D15, W5D23</w:t>
+              <w:t>W3D15, W5D23, W3SAT</w:t>
             </w:r>
           </w:p>
         </w:tc>
@@ -5862,7 +5862,7 @@
                 <w:rFonts w:ascii="Arial" w:hAnsi="Arial" w:eastAsia="Malgun Gothic"/>
                 <w:b w:val="0"/>
               </w:rPr>
-              <w:t>예배 후 새 친구 만나기</w:t>
+              <w:t>예배 후 새 친구 만나기 종합 복습</w:t>
             </w:r>
           </w:p>
         </w:tc>
@@ -5978,7 +5978,7 @@
                 <w:rFonts w:ascii="Arial" w:hAnsi="Arial" w:eastAsia="Malgun Gothic"/>
                 <w:b w:val="0"/>
               </w:rPr>
-              <w:t>교회 식사 자리에서 다시 만나기</w:t>
+              <w:t>생활 대화와 돌봄 종합 복습</w:t>
             </w:r>
           </w:p>
         </w:tc>
@@ -5997,7 +5997,7 @@
                 <w:rFonts w:ascii="Arial" w:hAnsi="Arial" w:eastAsia="Malgun Gothic"/>
                 <w:b w:val="0"/>
               </w:rPr>
-              <w:t>교회 식사 자리에서 음식을 나누며 대화하는 장면</w:t>
+              <w:t>상대를 위로하며 기도해 주겠다고 말하는 장면</w:t>
             </w:r>
           </w:p>
         </w:tc>
@@ -6016,7 +6016,7 @@
                 <w:rFonts w:ascii="Arial" w:hAnsi="Arial" w:eastAsia="Malgun Gothic"/>
                 <w:b w:val="0"/>
               </w:rPr>
-              <w:t>assets/images/scenes/meal_table_fellowship.jpg</w:t>
+              <w:t>assets/images/scenes/prayer_support.jpg</w:t>
             </w:r>
           </w:p>
         </w:tc>
@@ -6094,7 +6094,7 @@
                 <w:rFonts w:ascii="Arial" w:hAnsi="Arial" w:eastAsia="Malgun Gothic"/>
                 <w:b w:val="0"/>
               </w:rPr>
-              <w:t>마음을 돌보고 축복하기</w:t>
+              <w:t>사랑·축복·찬양 초대 종합 복습</w:t>
             </w:r>
           </w:p>
         </w:tc>

</xml_diff>